<commit_message>
Requirements Processing Guide updated to include Categorizattion * requirements are categorized * ID format guide included * additional requirement added to Elicitation section * document formatting updated
</commit_message>
<xml_diff>
--- a/Documentation/Requirements Engineering/Requirements Processing Guide.docx
+++ b/Documentation/Requirements Engineering/Requirements Processing Guide.docx
@@ -10,159 +10,582 @@
           <w:rFonts w:ascii="Times New Roman" w:hAnsi="Times New Roman" w:cs="Times New Roman"/>
           <w:b/>
           <w:bCs/>
-          <w:lang w:val="es-AR"/>
-        </w:rPr>
-      </w:pPr>
-      <w:proofErr w:type="spellStart"/>
+        </w:rPr>
+      </w:pPr>
       <w:r>
         <w:rPr>
           <w:rFonts w:ascii="Times New Roman" w:hAnsi="Times New Roman" w:cs="Times New Roman"/>
           <w:b/>
           <w:bCs/>
-          <w:lang w:val="es-AR"/>
-        </w:rPr>
-        <w:t>Requirements</w:t>
-      </w:r>
-      <w:proofErr w:type="spellEnd"/>
-      <w:r>
+        </w:rPr>
+        <w:t>Requirements Processing Guide</w:t>
+      </w:r>
+    </w:p>
+    <w:p>
+      <w:pPr>
+        <w:spacing w:line="360" w:lineRule="auto"/>
+        <w:jc w:val="center"/>
+        <w:rPr>
+          <w:rFonts w:ascii="Times New Roman" w:hAnsi="Times New Roman" w:cs="Times New Roman"/>
+        </w:rPr>
+      </w:pPr>
+      <w:r>
+        <w:rPr>
+          <w:rFonts w:ascii="Times New Roman" w:hAnsi="Times New Roman" w:cs="Times New Roman"/>
+        </w:rPr>
+        <w:t>SWE 3313, Section 03</w:t>
+      </w:r>
+    </w:p>
+    <w:p>
+      <w:pPr>
+        <w:spacing w:line="360" w:lineRule="auto"/>
+        <w:jc w:val="center"/>
+        <w:rPr>
+          <w:rFonts w:ascii="Times New Roman" w:hAnsi="Times New Roman" w:cs="Times New Roman"/>
+        </w:rPr>
+      </w:pPr>
+      <w:r>
+        <w:rPr>
+          <w:rFonts w:ascii="Times New Roman" w:hAnsi="Times New Roman" w:cs="Times New Roman"/>
+        </w:rPr>
+        <w:t>Team DS</w:t>
+      </w:r>
+    </w:p>
+    <w:p>
+      <w:pPr>
+        <w:spacing w:line="360" w:lineRule="auto"/>
+        <w:jc w:val="center"/>
+        <w:rPr>
+          <w:rFonts w:ascii="Times New Roman" w:hAnsi="Times New Roman" w:cs="Times New Roman"/>
+        </w:rPr>
+      </w:pPr>
+      <w:r>
+        <w:rPr>
+          <w:rFonts w:ascii="Times New Roman" w:hAnsi="Times New Roman" w:cs="Times New Roman"/>
+        </w:rPr>
+        <w:t>March 2026</w:t>
+      </w:r>
+    </w:p>
+    <w:p>
+      <w:pPr>
+        <w:spacing w:line="360" w:lineRule="auto"/>
+        <w:rPr>
+          <w:rFonts w:ascii="Times New Roman" w:hAnsi="Times New Roman" w:cs="Times New Roman"/>
+        </w:rPr>
+      </w:pPr>
+    </w:p>
+    <w:p>
+      <w:pPr>
+        <w:spacing w:line="360" w:lineRule="auto"/>
+        <w:rPr>
+          <w:rFonts w:ascii="Times New Roman" w:hAnsi="Times New Roman" w:cs="Times New Roman"/>
+        </w:rPr>
+      </w:pPr>
+      <w:r>
+        <w:rPr>
+          <w:rFonts w:ascii="Times New Roman" w:hAnsi="Times New Roman" w:cs="Times New Roman"/>
+        </w:rPr>
+        <w:t>El</w:t>
+      </w:r>
+      <w:r>
+        <w:rPr>
+          <w:rFonts w:ascii="Times New Roman" w:hAnsi="Times New Roman" w:cs="Times New Roman"/>
+        </w:rPr>
+        <w:t xml:space="preserve">icitation … … … … … … … … … … … … … … … … … … … … 2 </w:t>
+      </w:r>
+      <w:r>
+        <w:rPr>
+          <w:rFonts w:ascii="Times New Roman" w:hAnsi="Times New Roman" w:cs="Times New Roman"/>
+        </w:rPr>
+        <w:t>–</w:t>
+      </w:r>
+      <w:r>
+        <w:rPr>
+          <w:rFonts w:ascii="Times New Roman" w:hAnsi="Times New Roman" w:cs="Times New Roman"/>
+        </w:rPr>
+        <w:t xml:space="preserve"> </w:t>
+      </w:r>
+      <w:r>
+        <w:rPr>
+          <w:rFonts w:ascii="Times New Roman" w:hAnsi="Times New Roman" w:cs="Times New Roman"/>
+        </w:rPr>
+        <w:t>4</w:t>
+      </w:r>
+    </w:p>
+    <w:p>
+      <w:pPr>
+        <w:spacing w:line="360" w:lineRule="auto"/>
+        <w:rPr>
+          <w:rFonts w:ascii="Times New Roman" w:hAnsi="Times New Roman" w:cs="Times New Roman"/>
+        </w:rPr>
+      </w:pPr>
+      <w:r>
+        <w:rPr>
+          <w:rFonts w:ascii="Times New Roman" w:hAnsi="Times New Roman" w:cs="Times New Roman"/>
+        </w:rPr>
+        <w:tab/>
+      </w:r>
+      <w:r>
+        <w:rPr>
+          <w:rFonts w:ascii="Times New Roman" w:hAnsi="Times New Roman" w:cs="Times New Roman"/>
+          <w:i/>
+          <w:iCs/>
+        </w:rPr>
+        <w:t>Resources</w:t>
+      </w:r>
+      <w:r>
+        <w:rPr>
+          <w:rFonts w:ascii="Times New Roman" w:hAnsi="Times New Roman" w:cs="Times New Roman"/>
+        </w:rPr>
+        <w:t xml:space="preserve"> … … … … … … … … … … … … … … … … … ... 2</w:t>
+      </w:r>
+    </w:p>
+    <w:p>
+      <w:pPr>
+        <w:spacing w:line="360" w:lineRule="auto"/>
+        <w:rPr>
+          <w:rFonts w:ascii="Times New Roman" w:hAnsi="Times New Roman" w:cs="Times New Roman"/>
+        </w:rPr>
+      </w:pPr>
+      <w:r>
+        <w:rPr>
+          <w:rFonts w:ascii="Times New Roman" w:hAnsi="Times New Roman" w:cs="Times New Roman"/>
+        </w:rPr>
+        <w:tab/>
+      </w:r>
+      <w:r>
+        <w:rPr>
+          <w:rFonts w:ascii="Times New Roman" w:hAnsi="Times New Roman" w:cs="Times New Roman"/>
+          <w:i/>
+          <w:iCs/>
+        </w:rPr>
+        <w:t>Justification</w:t>
+      </w:r>
+      <w:r>
+        <w:rPr>
+          <w:rFonts w:ascii="Times New Roman" w:hAnsi="Times New Roman" w:cs="Times New Roman"/>
+        </w:rPr>
+        <w:t xml:space="preserve"> … … … … … … … … … … … … … … … … …  2</w:t>
+      </w:r>
+    </w:p>
+    <w:p>
+      <w:pPr>
+        <w:spacing w:line="360" w:lineRule="auto"/>
+        <w:rPr>
+          <w:rFonts w:ascii="Times New Roman" w:hAnsi="Times New Roman" w:cs="Times New Roman"/>
+        </w:rPr>
+      </w:pPr>
+      <w:r>
+        <w:rPr>
+          <w:rFonts w:ascii="Times New Roman" w:hAnsi="Times New Roman" w:cs="Times New Roman"/>
+        </w:rPr>
+        <w:tab/>
+      </w:r>
+      <w:r>
+        <w:rPr>
+          <w:rFonts w:ascii="Times New Roman" w:hAnsi="Times New Roman" w:cs="Times New Roman"/>
+          <w:i/>
+          <w:iCs/>
+        </w:rPr>
+        <w:t>Required Staff Functionalities</w:t>
+      </w:r>
+      <w:r>
+        <w:rPr>
+          <w:rFonts w:ascii="Times New Roman" w:hAnsi="Times New Roman" w:cs="Times New Roman"/>
+        </w:rPr>
+        <w:t xml:space="preserve"> </w:t>
+      </w:r>
+      <w:r>
+        <w:rPr>
+          <w:rFonts w:ascii="Times New Roman" w:hAnsi="Times New Roman" w:cs="Times New Roman"/>
+        </w:rPr>
+        <w:t>… … … … … … … …</w:t>
+      </w:r>
+      <w:r>
+        <w:rPr>
+          <w:rFonts w:ascii="Times New Roman" w:hAnsi="Times New Roman" w:cs="Times New Roman"/>
+        </w:rPr>
+        <w:t xml:space="preserve"> … </w:t>
+      </w:r>
+      <w:proofErr w:type="gramStart"/>
+      <w:r>
+        <w:rPr>
+          <w:rFonts w:ascii="Times New Roman" w:hAnsi="Times New Roman" w:cs="Times New Roman"/>
+        </w:rPr>
+        <w:t>… .</w:t>
+      </w:r>
+      <w:proofErr w:type="gramEnd"/>
+      <w:r>
+        <w:rPr>
+          <w:rFonts w:ascii="Times New Roman" w:hAnsi="Times New Roman" w:cs="Times New Roman"/>
+        </w:rPr>
+        <w:t xml:space="preserve"> 2 - 3</w:t>
+      </w:r>
+    </w:p>
+    <w:p>
+      <w:pPr>
+        <w:spacing w:line="360" w:lineRule="auto"/>
+        <w:rPr>
+          <w:rFonts w:ascii="Times New Roman" w:hAnsi="Times New Roman" w:cs="Times New Roman"/>
+        </w:rPr>
+      </w:pPr>
+      <w:r>
+        <w:rPr>
+          <w:rFonts w:ascii="Times New Roman" w:hAnsi="Times New Roman" w:cs="Times New Roman"/>
+        </w:rPr>
+        <w:tab/>
+      </w:r>
+      <w:r>
+        <w:rPr>
+          <w:rFonts w:ascii="Times New Roman" w:hAnsi="Times New Roman" w:cs="Times New Roman"/>
+          <w:i/>
+          <w:iCs/>
+        </w:rPr>
+        <w:t>Performance Requirements</w:t>
+      </w:r>
+      <w:r>
+        <w:rPr>
+          <w:rFonts w:ascii="Times New Roman" w:hAnsi="Times New Roman" w:cs="Times New Roman"/>
+        </w:rPr>
+        <w:t xml:space="preserve"> </w:t>
+      </w:r>
+      <w:r>
+        <w:rPr>
+          <w:rFonts w:ascii="Times New Roman" w:hAnsi="Times New Roman" w:cs="Times New Roman"/>
+        </w:rPr>
+        <w:t>… … … … … … … …</w:t>
+      </w:r>
+      <w:r>
+        <w:rPr>
+          <w:rFonts w:ascii="Times New Roman" w:hAnsi="Times New Roman" w:cs="Times New Roman"/>
+        </w:rPr>
+        <w:t xml:space="preserve"> … … … </w:t>
+      </w:r>
+      <w:proofErr w:type="gramStart"/>
+      <w:r>
+        <w:rPr>
+          <w:rFonts w:ascii="Times New Roman" w:hAnsi="Times New Roman" w:cs="Times New Roman"/>
+        </w:rPr>
+        <w:t>… .</w:t>
+      </w:r>
+      <w:proofErr w:type="gramEnd"/>
+      <w:r>
+        <w:rPr>
+          <w:rFonts w:ascii="Times New Roman" w:hAnsi="Times New Roman" w:cs="Times New Roman"/>
+        </w:rPr>
+        <w:t xml:space="preserve"> 3</w:t>
+      </w:r>
+    </w:p>
+    <w:p>
+      <w:pPr>
+        <w:spacing w:line="360" w:lineRule="auto"/>
+        <w:rPr>
+          <w:rFonts w:ascii="Times New Roman" w:hAnsi="Times New Roman" w:cs="Times New Roman"/>
+        </w:rPr>
+      </w:pPr>
+      <w:r>
+        <w:rPr>
+          <w:rFonts w:ascii="Times New Roman" w:hAnsi="Times New Roman" w:cs="Times New Roman"/>
+        </w:rPr>
+        <w:tab/>
+      </w:r>
+      <w:r>
+        <w:rPr>
+          <w:rFonts w:ascii="Times New Roman" w:hAnsi="Times New Roman" w:cs="Times New Roman"/>
+          <w:i/>
+          <w:iCs/>
+        </w:rPr>
+        <w:t>Logistical Requirements</w:t>
+      </w:r>
+      <w:r>
+        <w:rPr>
+          <w:rFonts w:ascii="Times New Roman" w:hAnsi="Times New Roman" w:cs="Times New Roman"/>
+        </w:rPr>
+        <w:t xml:space="preserve"> </w:t>
+      </w:r>
+      <w:r>
+        <w:rPr>
+          <w:rFonts w:ascii="Times New Roman" w:hAnsi="Times New Roman" w:cs="Times New Roman"/>
+        </w:rPr>
+        <w:t>… … … … … … … …</w:t>
+      </w:r>
+      <w:r>
+        <w:rPr>
+          <w:rFonts w:ascii="Times New Roman" w:hAnsi="Times New Roman" w:cs="Times New Roman"/>
+        </w:rPr>
+        <w:t xml:space="preserve"> … … … … …  3</w:t>
+      </w:r>
+    </w:p>
+    <w:p>
+      <w:pPr>
+        <w:spacing w:line="360" w:lineRule="auto"/>
+        <w:rPr>
+          <w:rFonts w:ascii="Times New Roman" w:hAnsi="Times New Roman" w:cs="Times New Roman"/>
+        </w:rPr>
+      </w:pPr>
+      <w:r>
+        <w:rPr>
+          <w:rFonts w:ascii="Times New Roman" w:hAnsi="Times New Roman" w:cs="Times New Roman"/>
+        </w:rPr>
+        <w:t xml:space="preserve">Categorization </w:t>
+      </w:r>
+      <w:r>
+        <w:rPr>
+          <w:rFonts w:ascii="Times New Roman" w:hAnsi="Times New Roman" w:cs="Times New Roman"/>
+        </w:rPr>
+        <w:t>… … … … … … … …</w:t>
+      </w:r>
+      <w:r>
+        <w:rPr>
+          <w:rFonts w:ascii="Times New Roman" w:hAnsi="Times New Roman" w:cs="Times New Roman"/>
+        </w:rPr>
+        <w:t xml:space="preserve"> </w:t>
+      </w:r>
+      <w:r>
+        <w:rPr>
+          <w:rFonts w:ascii="Times New Roman" w:hAnsi="Times New Roman" w:cs="Times New Roman"/>
+        </w:rPr>
+        <w:t>… … … … … … … …</w:t>
+      </w:r>
+      <w:r>
+        <w:rPr>
+          <w:rFonts w:ascii="Times New Roman" w:hAnsi="Times New Roman" w:cs="Times New Roman"/>
+        </w:rPr>
+        <w:t xml:space="preserve"> </w:t>
+      </w:r>
+      <w:r>
+        <w:rPr>
+          <w:rFonts w:ascii="Times New Roman" w:hAnsi="Times New Roman" w:cs="Times New Roman"/>
+        </w:rPr>
+        <w:t>… …</w:t>
+      </w:r>
+      <w:proofErr w:type="gramStart"/>
+      <w:r>
+        <w:rPr>
+          <w:rFonts w:ascii="Times New Roman" w:hAnsi="Times New Roman" w:cs="Times New Roman"/>
+        </w:rPr>
+        <w:t xml:space="preserve"> </w:t>
+      </w:r>
+      <w:r>
+        <w:rPr>
+          <w:rFonts w:ascii="Times New Roman" w:hAnsi="Times New Roman" w:cs="Times New Roman"/>
+        </w:rPr>
+        <w:t>..</w:t>
+      </w:r>
+      <w:proofErr w:type="gramEnd"/>
+      <w:r>
+        <w:rPr>
+          <w:rFonts w:ascii="Times New Roman" w:hAnsi="Times New Roman" w:cs="Times New Roman"/>
+        </w:rPr>
+        <w:t xml:space="preserve"> 4 – 6</w:t>
+      </w:r>
+    </w:p>
+    <w:p>
+      <w:pPr>
+        <w:spacing w:line="360" w:lineRule="auto"/>
+        <w:rPr>
+          <w:rFonts w:ascii="Times New Roman" w:hAnsi="Times New Roman" w:cs="Times New Roman"/>
+        </w:rPr>
+      </w:pPr>
+      <w:r>
+        <w:rPr>
+          <w:rFonts w:ascii="Times New Roman" w:hAnsi="Times New Roman" w:cs="Times New Roman"/>
+        </w:rPr>
+        <w:tab/>
+      </w:r>
+      <w:r>
+        <w:rPr>
+          <w:rFonts w:ascii="Times New Roman" w:hAnsi="Times New Roman" w:cs="Times New Roman"/>
+          <w:i/>
+          <w:iCs/>
+        </w:rPr>
+        <w:t>Categories</w:t>
+      </w:r>
+      <w:r>
+        <w:rPr>
+          <w:rFonts w:ascii="Times New Roman" w:hAnsi="Times New Roman" w:cs="Times New Roman"/>
+        </w:rPr>
+        <w:t xml:space="preserve"> </w:t>
+      </w:r>
+      <w:r>
+        <w:rPr>
+          <w:rFonts w:ascii="Times New Roman" w:hAnsi="Times New Roman" w:cs="Times New Roman"/>
+        </w:rPr>
+        <w:t>… … … … … … … …</w:t>
+      </w:r>
+      <w:r>
+        <w:rPr>
+          <w:rFonts w:ascii="Times New Roman" w:hAnsi="Times New Roman" w:cs="Times New Roman"/>
+        </w:rPr>
+        <w:t xml:space="preserve"> … … … …. … … … … . 4 - 5</w:t>
+      </w:r>
+    </w:p>
+    <w:p>
+      <w:pPr>
+        <w:spacing w:line="360" w:lineRule="auto"/>
+        <w:rPr>
+          <w:rFonts w:ascii="Times New Roman" w:hAnsi="Times New Roman" w:cs="Times New Roman"/>
+        </w:rPr>
+      </w:pPr>
+      <w:r>
+        <w:rPr>
+          <w:rFonts w:ascii="Times New Roman" w:hAnsi="Times New Roman" w:cs="Times New Roman"/>
+        </w:rPr>
+        <w:tab/>
+      </w:r>
+      <w:r>
+        <w:rPr>
+          <w:rFonts w:ascii="Times New Roman" w:hAnsi="Times New Roman" w:cs="Times New Roman"/>
+          <w:i/>
+          <w:iCs/>
+        </w:rPr>
+        <w:t>Requirement ID Formatting</w:t>
+      </w:r>
+      <w:r>
+        <w:rPr>
+          <w:rFonts w:ascii="Times New Roman" w:hAnsi="Times New Roman" w:cs="Times New Roman"/>
+        </w:rPr>
+        <w:t xml:space="preserve"> </w:t>
+      </w:r>
+      <w:r>
+        <w:rPr>
+          <w:rFonts w:ascii="Times New Roman" w:hAnsi="Times New Roman" w:cs="Times New Roman"/>
+        </w:rPr>
+        <w:t>… … … … … … … …</w:t>
+      </w:r>
+      <w:r>
+        <w:rPr>
+          <w:rFonts w:ascii="Times New Roman" w:hAnsi="Times New Roman" w:cs="Times New Roman"/>
+        </w:rPr>
+        <w:t xml:space="preserve"> … … … 5 - 6</w:t>
+      </w:r>
+    </w:p>
+    <w:p>
+      <w:pPr>
+        <w:spacing w:line="360" w:lineRule="auto"/>
+        <w:rPr>
+          <w:rFonts w:ascii="Times New Roman" w:hAnsi="Times New Roman" w:cs="Times New Roman"/>
+        </w:rPr>
+      </w:pPr>
+    </w:p>
+    <w:p>
+      <w:pPr>
+        <w:spacing w:line="360" w:lineRule="auto"/>
+        <w:rPr>
+          <w:rFonts w:ascii="Times New Roman" w:hAnsi="Times New Roman" w:cs="Times New Roman"/>
+        </w:rPr>
+      </w:pPr>
+    </w:p>
+    <w:p>
+      <w:pPr>
+        <w:spacing w:line="360" w:lineRule="auto"/>
+        <w:rPr>
+          <w:rFonts w:ascii="Times New Roman" w:hAnsi="Times New Roman" w:cs="Times New Roman"/>
+        </w:rPr>
+      </w:pPr>
+    </w:p>
+    <w:p>
+      <w:pPr>
+        <w:spacing w:line="360" w:lineRule="auto"/>
+        <w:rPr>
+          <w:rFonts w:ascii="Times New Roman" w:hAnsi="Times New Roman" w:cs="Times New Roman"/>
+        </w:rPr>
+      </w:pPr>
+    </w:p>
+    <w:p>
+      <w:pPr>
+        <w:spacing w:line="360" w:lineRule="auto"/>
+        <w:rPr>
+          <w:rFonts w:ascii="Times New Roman" w:hAnsi="Times New Roman" w:cs="Times New Roman"/>
+        </w:rPr>
+      </w:pPr>
+    </w:p>
+    <w:p>
+      <w:pPr>
+        <w:spacing w:line="360" w:lineRule="auto"/>
+        <w:rPr>
+          <w:rFonts w:ascii="Times New Roman" w:hAnsi="Times New Roman" w:cs="Times New Roman"/>
+        </w:rPr>
+      </w:pPr>
+    </w:p>
+    <w:p>
+      <w:pPr>
+        <w:spacing w:line="360" w:lineRule="auto"/>
+        <w:rPr>
+          <w:rFonts w:ascii="Times New Roman" w:hAnsi="Times New Roman" w:cs="Times New Roman"/>
+        </w:rPr>
+      </w:pPr>
+    </w:p>
+    <w:p>
+      <w:pPr>
+        <w:spacing w:line="360" w:lineRule="auto"/>
+        <w:rPr>
+          <w:rFonts w:ascii="Times New Roman" w:hAnsi="Times New Roman" w:cs="Times New Roman"/>
+        </w:rPr>
+      </w:pPr>
+    </w:p>
+    <w:p>
+      <w:pPr>
+        <w:spacing w:line="360" w:lineRule="auto"/>
+        <w:rPr>
+          <w:rFonts w:ascii="Times New Roman" w:hAnsi="Times New Roman" w:cs="Times New Roman"/>
+        </w:rPr>
+      </w:pPr>
+    </w:p>
+    <w:p>
+      <w:pPr>
+        <w:spacing w:line="360" w:lineRule="auto"/>
         <w:rPr>
           <w:rFonts w:ascii="Times New Roman" w:hAnsi="Times New Roman" w:cs="Times New Roman"/>
           <w:b/>
           <w:bCs/>
-          <w:lang w:val="es-AR"/>
-        </w:rPr>
-        <w:t xml:space="preserve"> Processing Guide</w:t>
-      </w:r>
-    </w:p>
-    <w:p>
-      <w:pPr>
-        <w:spacing w:line="360" w:lineRule="auto"/>
-        <w:jc w:val="center"/>
-        <w:rPr>
-          <w:rFonts w:ascii="Times New Roman" w:hAnsi="Times New Roman" w:cs="Times New Roman"/>
-          <w:lang w:val="es-AR"/>
-        </w:rPr>
-      </w:pPr>
-      <w:r>
-        <w:rPr>
-          <w:rFonts w:ascii="Times New Roman" w:hAnsi="Times New Roman" w:cs="Times New Roman"/>
-          <w:lang w:val="es-AR"/>
-        </w:rPr>
-        <w:t>SWE 3313, Section 03</w:t>
-      </w:r>
-    </w:p>
-    <w:p>
-      <w:pPr>
-        <w:spacing w:line="360" w:lineRule="auto"/>
-        <w:jc w:val="center"/>
-        <w:rPr>
-          <w:rFonts w:ascii="Times New Roman" w:hAnsi="Times New Roman" w:cs="Times New Roman"/>
-          <w:lang w:val="es-AR"/>
-        </w:rPr>
-      </w:pPr>
-      <w:r>
-        <w:rPr>
-          <w:rFonts w:ascii="Times New Roman" w:hAnsi="Times New Roman" w:cs="Times New Roman"/>
-          <w:lang w:val="es-AR"/>
-        </w:rPr>
-        <w:t>Team DS</w:t>
-      </w:r>
-    </w:p>
-    <w:p>
-      <w:pPr>
-        <w:spacing w:line="360" w:lineRule="auto"/>
-        <w:jc w:val="center"/>
-        <w:rPr>
-          <w:rFonts w:ascii="Times New Roman" w:hAnsi="Times New Roman" w:cs="Times New Roman"/>
-          <w:lang w:val="es-AR"/>
-        </w:rPr>
-      </w:pPr>
-      <w:r>
-        <w:rPr>
-          <w:rFonts w:ascii="Times New Roman" w:hAnsi="Times New Roman" w:cs="Times New Roman"/>
-          <w:lang w:val="es-AR"/>
-        </w:rPr>
-        <w:t>March 2026</w:t>
-      </w:r>
-    </w:p>
-    <w:p>
-      <w:pPr>
-        <w:spacing w:line="360" w:lineRule="auto"/>
+        </w:rPr>
+      </w:pPr>
+      <w:r>
         <w:rPr>
           <w:rFonts w:ascii="Times New Roman" w:hAnsi="Times New Roman" w:cs="Times New Roman"/>
           <w:b/>
           <w:bCs/>
-          <w:lang w:val="es-AR"/>
-        </w:rPr>
-      </w:pPr>
-      <w:proofErr w:type="spellStart"/>
-      <w:r>
-        <w:rPr>
-          <w:rFonts w:ascii="Times New Roman" w:hAnsi="Times New Roman" w:cs="Times New Roman"/>
-          <w:b/>
-          <w:bCs/>
-          <w:lang w:val="es-AR"/>
-        </w:rPr>
+        </w:rPr>
+        <w:lastRenderedPageBreak/>
         <w:t>Elicitation</w:t>
       </w:r>
-      <w:proofErr w:type="spellEnd"/>
-    </w:p>
-    <w:p>
-      <w:pPr>
-        <w:spacing w:line="360" w:lineRule="auto"/>
-        <w:rPr>
-          <w:rFonts w:ascii="Times New Roman" w:hAnsi="Times New Roman" w:cs="Times New Roman"/>
-          <w:lang w:val="es-AR"/>
-        </w:rPr>
-      </w:pPr>
-      <w:r>
-        <w:rPr>
-          <w:rFonts w:ascii="Times New Roman" w:hAnsi="Times New Roman" w:cs="Times New Roman"/>
-          <w:lang w:val="es-AR"/>
+    </w:p>
+    <w:p>
+      <w:pPr>
+        <w:spacing w:line="360" w:lineRule="auto"/>
+        <w:rPr>
+          <w:rFonts w:ascii="Times New Roman" w:hAnsi="Times New Roman" w:cs="Times New Roman"/>
+        </w:rPr>
+      </w:pPr>
+      <w:r>
+        <w:rPr>
+          <w:rFonts w:ascii="Times New Roman" w:hAnsi="Times New Roman" w:cs="Times New Roman"/>
         </w:rPr>
         <w:tab/>
       </w:r>
-      <w:proofErr w:type="spellStart"/>
       <w:r>
         <w:rPr>
           <w:rFonts w:ascii="Times New Roman" w:hAnsi="Times New Roman" w:cs="Times New Roman"/>
           <w:i/>
           <w:iCs/>
-          <w:lang w:val="es-AR"/>
         </w:rPr>
         <w:t>Resources</w:t>
       </w:r>
-      <w:proofErr w:type="spellEnd"/>
-    </w:p>
-    <w:p>
-      <w:pPr>
-        <w:pStyle w:val="ListParagraph"/>
-        <w:numPr>
-          <w:ilvl w:val="0"/>
-          <w:numId w:val="1"/>
-        </w:numPr>
-        <w:spacing w:line="360" w:lineRule="auto"/>
-        <w:rPr>
-          <w:rFonts w:ascii="Times New Roman" w:hAnsi="Times New Roman" w:cs="Times New Roman"/>
-        </w:rPr>
-      </w:pPr>
-      <w:hyperlink r:id="rId5" w:history="1">
-        <w:proofErr w:type="gramStart"/>
-        <w:r>
-          <w:rPr>
-            <w:rStyle w:val="Hyperlink"/>
-            <w:rFonts w:ascii="Times New Roman" w:hAnsi="Times New Roman" w:cs="Times New Roman"/>
-          </w:rPr>
-          <w:t>..</w:t>
-        </w:r>
-        <w:proofErr w:type="gramEnd"/>
-        <w:r>
-          <w:rPr>
-            <w:rStyle w:val="Hyperlink"/>
-            <w:rFonts w:ascii="Times New Roman" w:hAnsi="Times New Roman" w:cs="Times New Roman"/>
-          </w:rPr>
-          <w:t>\</w:t>
-        </w:r>
+    </w:p>
+    <w:p>
+      <w:pPr>
+        <w:pStyle w:val="ListParagraph"/>
+        <w:numPr>
+          <w:ilvl w:val="0"/>
+          <w:numId w:val="1"/>
+        </w:numPr>
+        <w:spacing w:line="360" w:lineRule="auto"/>
+        <w:rPr>
+          <w:rFonts w:ascii="Times New Roman" w:hAnsi="Times New Roman" w:cs="Times New Roman"/>
+        </w:rPr>
+      </w:pPr>
+      <w:hyperlink r:id="rId7" w:history="1">
         <w:proofErr w:type="spellStart"/>
         <w:r>
           <w:rPr>
@@ -193,24 +616,21 @@
           <w:rFonts w:ascii="Times New Roman" w:hAnsi="Times New Roman" w:cs="Times New Roman"/>
         </w:rPr>
       </w:pPr>
-      <w:hyperlink r:id="rId6" w:history="1">
-        <w:proofErr w:type="gramStart"/>
+      <w:hyperlink r:id="rId8" w:history="1">
         <w:r>
           <w:rPr>
             <w:rStyle w:val="Hyperlink"/>
             <w:rFonts w:ascii="Times New Roman" w:hAnsi="Times New Roman" w:cs="Times New Roman"/>
           </w:rPr>
-          <w:t>..</w:t>
-        </w:r>
-        <w:proofErr w:type="gramEnd"/>
-        <w:r>
-          <w:rPr>
-            <w:rStyle w:val="Hyperlink"/>
-            <w:rFonts w:ascii="Times New Roman" w:hAnsi="Times New Roman" w:cs="Times New Roman"/>
-          </w:rPr>
-          <w:t>\Project Overview.pdf</w:t>
+          <w:t>Project Overview</w:t>
         </w:r>
       </w:hyperlink>
+      <w:r>
+        <w:rPr>
+          <w:rFonts w:ascii="Times New Roman" w:hAnsi="Times New Roman" w:cs="Times New Roman"/>
+        </w:rPr>
+        <w:t xml:space="preserve"> </w:t>
+      </w:r>
     </w:p>
     <w:p>
       <w:pPr>
@@ -310,7 +730,23 @@
           <w:i/>
           <w:iCs/>
         </w:rPr>
-        <w:t>Required Functionalities</w:t>
+        <w:t xml:space="preserve">Required </w:t>
+      </w:r>
+      <w:r>
+        <w:rPr>
+          <w:rFonts w:ascii="Times New Roman" w:hAnsi="Times New Roman" w:cs="Times New Roman"/>
+          <w:i/>
+          <w:iCs/>
+        </w:rPr>
+        <w:t xml:space="preserve">Staff </w:t>
+      </w:r>
+      <w:r>
+        <w:rPr>
+          <w:rFonts w:ascii="Times New Roman" w:hAnsi="Times New Roman" w:cs="Times New Roman"/>
+          <w:i/>
+          <w:iCs/>
+        </w:rPr>
+        <w:t>Functionalities</w:t>
       </w:r>
     </w:p>
     <w:p>
@@ -505,64 +941,83 @@
         <w:rPr>
           <w:rFonts w:ascii="Times New Roman" w:hAnsi="Times New Roman" w:cs="Times New Roman"/>
         </w:rPr>
+        <w:t>The manager can assign shifts for all staff and can assign waiters to specific tables.</w:t>
+      </w:r>
+    </w:p>
+    <w:p>
+      <w:pPr>
+        <w:pStyle w:val="ListParagraph"/>
+        <w:numPr>
+          <w:ilvl w:val="0"/>
+          <w:numId w:val="1"/>
+        </w:numPr>
+        <w:spacing w:line="360" w:lineRule="auto"/>
+        <w:rPr>
+          <w:rFonts w:ascii="Times New Roman" w:hAnsi="Times New Roman" w:cs="Times New Roman"/>
+        </w:rPr>
+      </w:pPr>
+      <w:r>
+        <w:rPr>
+          <w:rFonts w:ascii="Times New Roman" w:hAnsi="Times New Roman" w:cs="Times New Roman"/>
+        </w:rPr>
+        <w:t>The manager can view the inventory and order additional supplies.</w:t>
+      </w:r>
+    </w:p>
+    <w:p>
+      <w:pPr>
+        <w:pStyle w:val="ListParagraph"/>
+        <w:numPr>
+          <w:ilvl w:val="0"/>
+          <w:numId w:val="1"/>
+        </w:numPr>
+        <w:spacing w:line="360" w:lineRule="auto"/>
+        <w:rPr>
+          <w:rFonts w:ascii="Times New Roman" w:hAnsi="Times New Roman" w:cs="Times New Roman"/>
+        </w:rPr>
+      </w:pPr>
+      <w:r>
+        <w:rPr>
+          <w:rFonts w:ascii="Times New Roman" w:hAnsi="Times New Roman" w:cs="Times New Roman"/>
+        </w:rPr>
+        <w:t>The manager can view the data collected by the system and query it.</w:t>
+      </w:r>
+    </w:p>
+    <w:p>
+      <w:pPr>
+        <w:pStyle w:val="ListParagraph"/>
+        <w:numPr>
+          <w:ilvl w:val="0"/>
+          <w:numId w:val="1"/>
+        </w:numPr>
+        <w:spacing w:line="360" w:lineRule="auto"/>
+        <w:rPr>
+          <w:rFonts w:ascii="Times New Roman" w:hAnsi="Times New Roman" w:cs="Times New Roman"/>
+        </w:rPr>
+      </w:pPr>
+      <w:r>
+        <w:rPr>
+          <w:rFonts w:ascii="Times New Roman" w:hAnsi="Times New Roman" w:cs="Times New Roman"/>
+        </w:rPr>
+        <w:t>The manager can update the menu.</w:t>
+      </w:r>
+    </w:p>
+    <w:p>
+      <w:pPr>
+        <w:pStyle w:val="ListParagraph"/>
+        <w:numPr>
+          <w:ilvl w:val="0"/>
+          <w:numId w:val="1"/>
+        </w:numPr>
+        <w:spacing w:line="360" w:lineRule="auto"/>
+        <w:rPr>
+          <w:rFonts w:ascii="Times New Roman" w:hAnsi="Times New Roman" w:cs="Times New Roman"/>
+        </w:rPr>
+      </w:pPr>
+      <w:r>
+        <w:rPr>
+          <w:rFonts w:ascii="Times New Roman" w:hAnsi="Times New Roman" w:cs="Times New Roman"/>
+        </w:rPr>
         <w:lastRenderedPageBreak/>
-        <w:t>The manager can assign shifts for all staff and can assign waiters to specific tables.</w:t>
-      </w:r>
-    </w:p>
-    <w:p>
-      <w:pPr>
-        <w:pStyle w:val="ListParagraph"/>
-        <w:numPr>
-          <w:ilvl w:val="0"/>
-          <w:numId w:val="1"/>
-        </w:numPr>
-        <w:spacing w:line="360" w:lineRule="auto"/>
-        <w:rPr>
-          <w:rFonts w:ascii="Times New Roman" w:hAnsi="Times New Roman" w:cs="Times New Roman"/>
-        </w:rPr>
-      </w:pPr>
-      <w:r>
-        <w:rPr>
-          <w:rFonts w:ascii="Times New Roman" w:hAnsi="Times New Roman" w:cs="Times New Roman"/>
-        </w:rPr>
-        <w:t>The manager can view the inventory and order additional supplies.</w:t>
-      </w:r>
-    </w:p>
-    <w:p>
-      <w:pPr>
-        <w:pStyle w:val="ListParagraph"/>
-        <w:numPr>
-          <w:ilvl w:val="0"/>
-          <w:numId w:val="1"/>
-        </w:numPr>
-        <w:spacing w:line="360" w:lineRule="auto"/>
-        <w:rPr>
-          <w:rFonts w:ascii="Times New Roman" w:hAnsi="Times New Roman" w:cs="Times New Roman"/>
-        </w:rPr>
-      </w:pPr>
-      <w:r>
-        <w:rPr>
-          <w:rFonts w:ascii="Times New Roman" w:hAnsi="Times New Roman" w:cs="Times New Roman"/>
-        </w:rPr>
-        <w:t>The manager can view the data collected by the system and query it.</w:t>
-      </w:r>
-    </w:p>
-    <w:p>
-      <w:pPr>
-        <w:pStyle w:val="ListParagraph"/>
-        <w:numPr>
-          <w:ilvl w:val="0"/>
-          <w:numId w:val="1"/>
-        </w:numPr>
-        <w:spacing w:line="360" w:lineRule="auto"/>
-        <w:rPr>
-          <w:rFonts w:ascii="Times New Roman" w:hAnsi="Times New Roman" w:cs="Times New Roman"/>
-        </w:rPr>
-      </w:pPr>
-      <w:r>
-        <w:rPr>
-          <w:rFonts w:ascii="Times New Roman" w:hAnsi="Times New Roman" w:cs="Times New Roman"/>
-        </w:rPr>
         <w:t xml:space="preserve">The system stores </w:t>
       </w:r>
       <w:proofErr w:type="gramStart"/>
@@ -975,7 +1430,1626 @@
         <w:t>The user should be able to easily navigate the system.</w:t>
       </w:r>
     </w:p>
+    <w:p>
+      <w:pPr>
+        <w:spacing w:line="360" w:lineRule="auto"/>
+        <w:ind w:left="720"/>
+        <w:rPr>
+          <w:rFonts w:ascii="Times New Roman" w:hAnsi="Times New Roman" w:cs="Times New Roman"/>
+        </w:rPr>
+      </w:pPr>
+      <w:r>
+        <w:rPr>
+          <w:rFonts w:ascii="Times New Roman" w:hAnsi="Times New Roman" w:cs="Times New Roman"/>
+          <w:i/>
+          <w:iCs/>
+        </w:rPr>
+        <w:t>Logistics Requirements</w:t>
+      </w:r>
+    </w:p>
+    <w:p>
+      <w:pPr>
+        <w:pStyle w:val="ListParagraph"/>
+        <w:numPr>
+          <w:ilvl w:val="0"/>
+          <w:numId w:val="1"/>
+        </w:numPr>
+        <w:spacing w:line="360" w:lineRule="auto"/>
+        <w:rPr>
+          <w:rFonts w:ascii="Times New Roman" w:hAnsi="Times New Roman" w:cs="Times New Roman"/>
+        </w:rPr>
+      </w:pPr>
+      <w:r>
+        <w:rPr>
+          <w:rFonts w:ascii="Times New Roman" w:hAnsi="Times New Roman" w:cs="Times New Roman"/>
+        </w:rPr>
+        <w:t>The system should operate on both touch screen and keyboard-reliant devices.</w:t>
+      </w:r>
+    </w:p>
+    <w:p>
+      <w:pPr>
+        <w:spacing w:line="360" w:lineRule="auto"/>
+        <w:rPr>
+          <w:rFonts w:ascii="Times New Roman" w:hAnsi="Times New Roman" w:cs="Times New Roman"/>
+        </w:rPr>
+      </w:pPr>
+    </w:p>
+    <w:p>
+      <w:pPr>
+        <w:spacing w:line="360" w:lineRule="auto"/>
+        <w:rPr>
+          <w:rFonts w:ascii="Times New Roman" w:hAnsi="Times New Roman" w:cs="Times New Roman"/>
+        </w:rPr>
+      </w:pPr>
+    </w:p>
+    <w:p>
+      <w:pPr>
+        <w:spacing w:line="360" w:lineRule="auto"/>
+        <w:rPr>
+          <w:rFonts w:ascii="Times New Roman" w:hAnsi="Times New Roman" w:cs="Times New Roman"/>
+        </w:rPr>
+      </w:pPr>
+    </w:p>
+    <w:p>
+      <w:pPr>
+        <w:spacing w:line="360" w:lineRule="auto"/>
+        <w:rPr>
+          <w:rFonts w:ascii="Times New Roman" w:hAnsi="Times New Roman" w:cs="Times New Roman"/>
+        </w:rPr>
+      </w:pPr>
+    </w:p>
+    <w:p>
+      <w:pPr>
+        <w:spacing w:line="360" w:lineRule="auto"/>
+        <w:rPr>
+          <w:rFonts w:ascii="Times New Roman" w:hAnsi="Times New Roman" w:cs="Times New Roman"/>
+          <w:b/>
+          <w:bCs/>
+        </w:rPr>
+      </w:pPr>
+      <w:r>
+        <w:rPr>
+          <w:rFonts w:ascii="Times New Roman" w:hAnsi="Times New Roman" w:cs="Times New Roman"/>
+          <w:b/>
+          <w:bCs/>
+        </w:rPr>
+        <w:lastRenderedPageBreak/>
+        <w:t>Categorization</w:t>
+      </w:r>
+    </w:p>
+    <w:p>
+      <w:pPr>
+        <w:spacing w:line="360" w:lineRule="auto"/>
+        <w:rPr>
+          <w:rFonts w:ascii="Times New Roman" w:hAnsi="Times New Roman" w:cs="Times New Roman"/>
+        </w:rPr>
+      </w:pPr>
+      <w:r>
+        <w:rPr>
+          <w:rFonts w:ascii="Times New Roman" w:hAnsi="Times New Roman" w:cs="Times New Roman"/>
+          <w:i/>
+          <w:iCs/>
+        </w:rPr>
+        <w:tab/>
+        <w:t>System Access</w:t>
+      </w:r>
+      <w:r>
+        <w:rPr>
+          <w:rFonts w:ascii="Times New Roman" w:hAnsi="Times New Roman" w:cs="Times New Roman"/>
+          <w:i/>
+          <w:iCs/>
+        </w:rPr>
+        <w:t xml:space="preserve"> (SA)</w:t>
+      </w:r>
+    </w:p>
+    <w:p>
+      <w:pPr>
+        <w:pStyle w:val="ListParagraph"/>
+        <w:numPr>
+          <w:ilvl w:val="0"/>
+          <w:numId w:val="1"/>
+        </w:numPr>
+        <w:spacing w:line="360" w:lineRule="auto"/>
+        <w:rPr>
+          <w:rFonts w:ascii="Times New Roman" w:hAnsi="Times New Roman" w:cs="Times New Roman"/>
+        </w:rPr>
+      </w:pPr>
+      <w:r>
+        <w:rPr>
+          <w:rFonts w:ascii="Times New Roman" w:hAnsi="Times New Roman" w:cs="Times New Roman"/>
+        </w:rPr>
+        <w:t>Assign every staff member a username</w:t>
+      </w:r>
+    </w:p>
+    <w:p>
+      <w:pPr>
+        <w:pStyle w:val="ListParagraph"/>
+        <w:numPr>
+          <w:ilvl w:val="0"/>
+          <w:numId w:val="1"/>
+        </w:numPr>
+        <w:spacing w:line="360" w:lineRule="auto"/>
+        <w:rPr>
+          <w:rFonts w:ascii="Times New Roman" w:hAnsi="Times New Roman" w:cs="Times New Roman"/>
+        </w:rPr>
+      </w:pPr>
+      <w:r>
+        <w:rPr>
+          <w:rFonts w:ascii="Times New Roman" w:hAnsi="Times New Roman" w:cs="Times New Roman"/>
+        </w:rPr>
+        <w:t>Construct module for user sign ups</w:t>
+      </w:r>
+    </w:p>
+    <w:p>
+      <w:pPr>
+        <w:pStyle w:val="ListParagraph"/>
+        <w:numPr>
+          <w:ilvl w:val="0"/>
+          <w:numId w:val="1"/>
+        </w:numPr>
+        <w:spacing w:line="360" w:lineRule="auto"/>
+        <w:rPr>
+          <w:rFonts w:ascii="Times New Roman" w:hAnsi="Times New Roman" w:cs="Times New Roman"/>
+        </w:rPr>
+      </w:pPr>
+      <w:r>
+        <w:rPr>
+          <w:rFonts w:ascii="Times New Roman" w:hAnsi="Times New Roman" w:cs="Times New Roman"/>
+        </w:rPr>
+        <w:t xml:space="preserve">Construct module to </w:t>
+      </w:r>
+      <w:proofErr w:type="gramStart"/>
+      <w:r>
+        <w:rPr>
+          <w:rFonts w:ascii="Times New Roman" w:hAnsi="Times New Roman" w:cs="Times New Roman"/>
+        </w:rPr>
+        <w:t>allow for</w:t>
+      </w:r>
+      <w:proofErr w:type="gramEnd"/>
+      <w:r>
+        <w:rPr>
+          <w:rFonts w:ascii="Times New Roman" w:hAnsi="Times New Roman" w:cs="Times New Roman"/>
+        </w:rPr>
+        <w:t xml:space="preserve"> user login</w:t>
+      </w:r>
+    </w:p>
+    <w:p>
+      <w:pPr>
+        <w:spacing w:line="360" w:lineRule="auto"/>
+        <w:rPr>
+          <w:rFonts w:ascii="Times New Roman" w:hAnsi="Times New Roman" w:cs="Times New Roman"/>
+          <w:i/>
+          <w:iCs/>
+        </w:rPr>
+      </w:pPr>
+      <w:r>
+        <w:rPr>
+          <w:rFonts w:ascii="Times New Roman" w:hAnsi="Times New Roman" w:cs="Times New Roman"/>
+        </w:rPr>
+        <w:tab/>
+      </w:r>
+      <w:r>
+        <w:rPr>
+          <w:rFonts w:ascii="Times New Roman" w:hAnsi="Times New Roman" w:cs="Times New Roman"/>
+          <w:i/>
+          <w:iCs/>
+        </w:rPr>
+        <w:t>Table Management</w:t>
+      </w:r>
+      <w:r>
+        <w:rPr>
+          <w:rFonts w:ascii="Times New Roman" w:hAnsi="Times New Roman" w:cs="Times New Roman"/>
+          <w:i/>
+          <w:iCs/>
+        </w:rPr>
+        <w:t xml:space="preserve"> (T)</w:t>
+      </w:r>
+    </w:p>
+    <w:p>
+      <w:pPr>
+        <w:pStyle w:val="ListParagraph"/>
+        <w:numPr>
+          <w:ilvl w:val="0"/>
+          <w:numId w:val="1"/>
+        </w:numPr>
+        <w:spacing w:line="360" w:lineRule="auto"/>
+        <w:rPr>
+          <w:rFonts w:ascii="Times New Roman" w:hAnsi="Times New Roman" w:cs="Times New Roman"/>
+        </w:rPr>
+      </w:pPr>
+      <w:r>
+        <w:rPr>
+          <w:rFonts w:ascii="Times New Roman" w:hAnsi="Times New Roman" w:cs="Times New Roman"/>
+        </w:rPr>
+        <w:t>Construct module for busboy/waiter to change table status</w:t>
+      </w:r>
+    </w:p>
+    <w:p>
+      <w:pPr>
+        <w:spacing w:line="360" w:lineRule="auto"/>
+        <w:rPr>
+          <w:rFonts w:ascii="Times New Roman" w:hAnsi="Times New Roman" w:cs="Times New Roman"/>
+        </w:rPr>
+      </w:pPr>
+      <w:r>
+        <w:rPr>
+          <w:rFonts w:ascii="Times New Roman" w:hAnsi="Times New Roman" w:cs="Times New Roman"/>
+          <w:i/>
+          <w:iCs/>
+        </w:rPr>
+        <w:tab/>
+        <w:t>Order Management (O)</w:t>
+      </w:r>
+    </w:p>
+    <w:p>
+      <w:pPr>
+        <w:pStyle w:val="ListParagraph"/>
+        <w:numPr>
+          <w:ilvl w:val="0"/>
+          <w:numId w:val="1"/>
+        </w:numPr>
+        <w:spacing w:line="360" w:lineRule="auto"/>
+        <w:rPr>
+          <w:rFonts w:ascii="Times New Roman" w:hAnsi="Times New Roman" w:cs="Times New Roman"/>
+        </w:rPr>
+      </w:pPr>
+      <w:r>
+        <w:rPr>
+          <w:rFonts w:ascii="Times New Roman" w:hAnsi="Times New Roman" w:cs="Times New Roman"/>
+        </w:rPr>
+        <w:t xml:space="preserve">Construct module for </w:t>
+      </w:r>
+      <w:proofErr w:type="gramStart"/>
+      <w:r>
+        <w:rPr>
+          <w:rFonts w:ascii="Times New Roman" w:hAnsi="Times New Roman" w:cs="Times New Roman"/>
+        </w:rPr>
+        <w:t>waiter</w:t>
+      </w:r>
+      <w:proofErr w:type="gramEnd"/>
+      <w:r>
+        <w:rPr>
+          <w:rFonts w:ascii="Times New Roman" w:hAnsi="Times New Roman" w:cs="Times New Roman"/>
+        </w:rPr>
+        <w:t xml:space="preserve"> to take orders</w:t>
+      </w:r>
+    </w:p>
+    <w:p>
+      <w:pPr>
+        <w:pStyle w:val="ListParagraph"/>
+        <w:numPr>
+          <w:ilvl w:val="0"/>
+          <w:numId w:val="1"/>
+        </w:numPr>
+        <w:spacing w:line="360" w:lineRule="auto"/>
+        <w:rPr>
+          <w:rFonts w:ascii="Times New Roman" w:hAnsi="Times New Roman" w:cs="Times New Roman"/>
+        </w:rPr>
+      </w:pPr>
+      <w:r>
+        <w:rPr>
+          <w:rFonts w:ascii="Times New Roman" w:hAnsi="Times New Roman" w:cs="Times New Roman"/>
+        </w:rPr>
+        <w:t xml:space="preserve">Construct </w:t>
+      </w:r>
+      <w:proofErr w:type="gramStart"/>
+      <w:r>
+        <w:rPr>
+          <w:rFonts w:ascii="Times New Roman" w:hAnsi="Times New Roman" w:cs="Times New Roman"/>
+        </w:rPr>
+        <w:t>module</w:t>
+      </w:r>
+      <w:proofErr w:type="gramEnd"/>
+      <w:r>
+        <w:rPr>
+          <w:rFonts w:ascii="Times New Roman" w:hAnsi="Times New Roman" w:cs="Times New Roman"/>
+        </w:rPr>
+        <w:t xml:space="preserve">(s) for </w:t>
+      </w:r>
+      <w:proofErr w:type="gramStart"/>
+      <w:r>
+        <w:rPr>
+          <w:rFonts w:ascii="Times New Roman" w:hAnsi="Times New Roman" w:cs="Times New Roman"/>
+        </w:rPr>
+        <w:t>cook</w:t>
+      </w:r>
+      <w:proofErr w:type="gramEnd"/>
+      <w:r>
+        <w:rPr>
+          <w:rFonts w:ascii="Times New Roman" w:hAnsi="Times New Roman" w:cs="Times New Roman"/>
+        </w:rPr>
+        <w:t xml:space="preserve"> to view orders and mark completion/notify waiter of completion</w:t>
+      </w:r>
+    </w:p>
+    <w:p>
+      <w:pPr>
+        <w:spacing w:line="360" w:lineRule="auto"/>
+        <w:rPr>
+          <w:rFonts w:ascii="Times New Roman" w:hAnsi="Times New Roman" w:cs="Times New Roman"/>
+        </w:rPr>
+      </w:pPr>
+      <w:r>
+        <w:rPr>
+          <w:rFonts w:ascii="Times New Roman" w:hAnsi="Times New Roman" w:cs="Times New Roman"/>
+          <w:i/>
+          <w:iCs/>
+        </w:rPr>
+        <w:tab/>
+        <w:t>Data Management (D)</w:t>
+      </w:r>
+    </w:p>
+    <w:p>
+      <w:pPr>
+        <w:pStyle w:val="ListParagraph"/>
+        <w:numPr>
+          <w:ilvl w:val="0"/>
+          <w:numId w:val="1"/>
+        </w:numPr>
+        <w:spacing w:line="360" w:lineRule="auto"/>
+        <w:rPr>
+          <w:rFonts w:ascii="Times New Roman" w:hAnsi="Times New Roman" w:cs="Times New Roman"/>
+        </w:rPr>
+      </w:pPr>
+      <w:r>
+        <w:rPr>
+          <w:rFonts w:ascii="Times New Roman" w:hAnsi="Times New Roman" w:cs="Times New Roman"/>
+        </w:rPr>
+        <w:t>Construct module to collect and store data for customer turnaround time</w:t>
+      </w:r>
+    </w:p>
+    <w:p>
+      <w:pPr>
+        <w:pStyle w:val="ListParagraph"/>
+        <w:numPr>
+          <w:ilvl w:val="0"/>
+          <w:numId w:val="1"/>
+        </w:numPr>
+        <w:spacing w:line="360" w:lineRule="auto"/>
+        <w:rPr>
+          <w:rFonts w:ascii="Times New Roman" w:hAnsi="Times New Roman" w:cs="Times New Roman"/>
+        </w:rPr>
+      </w:pPr>
+      <w:r>
+        <w:rPr>
+          <w:rFonts w:ascii="Times New Roman" w:hAnsi="Times New Roman" w:cs="Times New Roman"/>
+        </w:rPr>
+        <w:t xml:space="preserve">Construct module to collect and store data for </w:t>
+      </w:r>
+      <w:r>
+        <w:rPr>
+          <w:rFonts w:ascii="Times New Roman" w:hAnsi="Times New Roman" w:cs="Times New Roman"/>
+        </w:rPr>
+        <w:t>food preparation</w:t>
+      </w:r>
+      <w:r>
+        <w:rPr>
+          <w:rFonts w:ascii="Times New Roman" w:hAnsi="Times New Roman" w:cs="Times New Roman"/>
+        </w:rPr>
+        <w:t xml:space="preserve"> time</w:t>
+      </w:r>
+    </w:p>
+    <w:p>
+      <w:pPr>
+        <w:pStyle w:val="ListParagraph"/>
+        <w:numPr>
+          <w:ilvl w:val="0"/>
+          <w:numId w:val="1"/>
+        </w:numPr>
+        <w:spacing w:line="360" w:lineRule="auto"/>
+        <w:rPr>
+          <w:rFonts w:ascii="Times New Roman" w:hAnsi="Times New Roman" w:cs="Times New Roman"/>
+        </w:rPr>
+      </w:pPr>
+      <w:r>
+        <w:rPr>
+          <w:rFonts w:ascii="Times New Roman" w:hAnsi="Times New Roman" w:cs="Times New Roman"/>
+        </w:rPr>
+        <w:t>Construct module to collect and store data for revenue</w:t>
+      </w:r>
+    </w:p>
+    <w:p>
+      <w:pPr>
+        <w:pStyle w:val="ListParagraph"/>
+        <w:numPr>
+          <w:ilvl w:val="0"/>
+          <w:numId w:val="1"/>
+        </w:numPr>
+        <w:spacing w:line="360" w:lineRule="auto"/>
+        <w:rPr>
+          <w:rFonts w:ascii="Times New Roman" w:hAnsi="Times New Roman" w:cs="Times New Roman"/>
+        </w:rPr>
+      </w:pPr>
+      <w:r>
+        <w:rPr>
+          <w:rFonts w:ascii="Times New Roman" w:hAnsi="Times New Roman" w:cs="Times New Roman"/>
+        </w:rPr>
+        <w:t>Construct module to calculate and store data for revenue contribution percentage for each menu item</w:t>
+      </w:r>
+    </w:p>
+    <w:p>
+      <w:pPr>
+        <w:pStyle w:val="ListParagraph"/>
+        <w:numPr>
+          <w:ilvl w:val="0"/>
+          <w:numId w:val="1"/>
+        </w:numPr>
+        <w:spacing w:line="360" w:lineRule="auto"/>
+        <w:rPr>
+          <w:rFonts w:ascii="Times New Roman" w:hAnsi="Times New Roman" w:cs="Times New Roman"/>
+        </w:rPr>
+      </w:pPr>
+      <w:r>
+        <w:rPr>
+          <w:rFonts w:ascii="Times New Roman" w:hAnsi="Times New Roman" w:cs="Times New Roman"/>
+        </w:rPr>
+        <w:t>Construct module to collect data for menu item purchases and calculate and store the top 3 most popular</w:t>
+      </w:r>
+    </w:p>
+    <w:p>
+      <w:pPr>
+        <w:pStyle w:val="ListParagraph"/>
+        <w:numPr>
+          <w:ilvl w:val="0"/>
+          <w:numId w:val="1"/>
+        </w:numPr>
+        <w:spacing w:line="360" w:lineRule="auto"/>
+        <w:rPr>
+          <w:rFonts w:ascii="Times New Roman" w:hAnsi="Times New Roman" w:cs="Times New Roman"/>
+        </w:rPr>
+      </w:pPr>
+      <w:r>
+        <w:rPr>
+          <w:rFonts w:ascii="Times New Roman" w:hAnsi="Times New Roman" w:cs="Times New Roman"/>
+        </w:rPr>
+        <w:t xml:space="preserve">Construct module </w:t>
+      </w:r>
+      <w:r>
+        <w:rPr>
+          <w:rFonts w:ascii="Times New Roman" w:hAnsi="Times New Roman" w:cs="Times New Roman"/>
+        </w:rPr>
+        <w:t>to collect data for staff shift durations and calculate each staff member's earned wage</w:t>
+      </w:r>
+    </w:p>
+    <w:p>
+      <w:pPr>
+        <w:pStyle w:val="ListParagraph"/>
+        <w:numPr>
+          <w:ilvl w:val="0"/>
+          <w:numId w:val="1"/>
+        </w:numPr>
+        <w:spacing w:line="360" w:lineRule="auto"/>
+        <w:rPr>
+          <w:rFonts w:ascii="Times New Roman" w:hAnsi="Times New Roman" w:cs="Times New Roman"/>
+        </w:rPr>
+      </w:pPr>
+      <w:r>
+        <w:rPr>
+          <w:rFonts w:ascii="Times New Roman" w:hAnsi="Times New Roman" w:cs="Times New Roman"/>
+        </w:rPr>
+        <w:t xml:space="preserve">Construct module to collect and store data for duration of </w:t>
+      </w:r>
+      <w:proofErr w:type="gramStart"/>
+      <w:r>
+        <w:rPr>
+          <w:rFonts w:ascii="Times New Roman" w:hAnsi="Times New Roman" w:cs="Times New Roman"/>
+        </w:rPr>
+        <w:t>staff’s</w:t>
+      </w:r>
+      <w:proofErr w:type="gramEnd"/>
+      <w:r>
+        <w:rPr>
+          <w:rFonts w:ascii="Times New Roman" w:hAnsi="Times New Roman" w:cs="Times New Roman"/>
+        </w:rPr>
+        <w:t xml:space="preserve"> breaks</w:t>
+      </w:r>
+    </w:p>
+    <w:p>
+      <w:pPr>
+        <w:spacing w:line="360" w:lineRule="auto"/>
+        <w:rPr>
+          <w:rFonts w:ascii="Times New Roman" w:hAnsi="Times New Roman" w:cs="Times New Roman"/>
+          <w:i/>
+          <w:iCs/>
+        </w:rPr>
+      </w:pPr>
+      <w:r>
+        <w:rPr>
+          <w:rFonts w:ascii="Times New Roman" w:hAnsi="Times New Roman" w:cs="Times New Roman"/>
+          <w:i/>
+          <w:iCs/>
+        </w:rPr>
+        <w:tab/>
+        <w:t>Staff &amp; Shift Management (S</w:t>
+      </w:r>
+      <w:r>
+        <w:rPr>
+          <w:rFonts w:ascii="Times New Roman" w:hAnsi="Times New Roman" w:cs="Times New Roman"/>
+          <w:i/>
+          <w:iCs/>
+        </w:rPr>
+        <w:t>S</w:t>
+      </w:r>
+      <w:r>
+        <w:rPr>
+          <w:rFonts w:ascii="Times New Roman" w:hAnsi="Times New Roman" w:cs="Times New Roman"/>
+          <w:i/>
+          <w:iCs/>
+        </w:rPr>
+        <w:t>)</w:t>
+      </w:r>
+    </w:p>
+    <w:p>
+      <w:pPr>
+        <w:pStyle w:val="ListParagraph"/>
+        <w:numPr>
+          <w:ilvl w:val="0"/>
+          <w:numId w:val="1"/>
+        </w:numPr>
+        <w:spacing w:line="360" w:lineRule="auto"/>
+        <w:rPr>
+          <w:rFonts w:ascii="Times New Roman" w:hAnsi="Times New Roman" w:cs="Times New Roman"/>
+        </w:rPr>
+      </w:pPr>
+      <w:r>
+        <w:rPr>
+          <w:rFonts w:ascii="Times New Roman" w:hAnsi="Times New Roman" w:cs="Times New Roman"/>
+        </w:rPr>
+        <w:t>Construct module for clock-in/out</w:t>
+      </w:r>
+    </w:p>
+    <w:p>
+      <w:pPr>
+        <w:pStyle w:val="ListParagraph"/>
+        <w:numPr>
+          <w:ilvl w:val="0"/>
+          <w:numId w:val="1"/>
+        </w:numPr>
+        <w:spacing w:line="360" w:lineRule="auto"/>
+        <w:rPr>
+          <w:rFonts w:ascii="Times New Roman" w:hAnsi="Times New Roman" w:cs="Times New Roman"/>
+        </w:rPr>
+      </w:pPr>
+      <w:r>
+        <w:rPr>
+          <w:rFonts w:ascii="Times New Roman" w:hAnsi="Times New Roman" w:cs="Times New Roman"/>
+        </w:rPr>
+        <w:t xml:space="preserve">Construct module for </w:t>
+      </w:r>
+      <w:proofErr w:type="gramStart"/>
+      <w:r>
+        <w:rPr>
+          <w:rFonts w:ascii="Times New Roman" w:hAnsi="Times New Roman" w:cs="Times New Roman"/>
+        </w:rPr>
+        <w:t>manager</w:t>
+      </w:r>
+      <w:proofErr w:type="gramEnd"/>
+      <w:r>
+        <w:rPr>
+          <w:rFonts w:ascii="Times New Roman" w:hAnsi="Times New Roman" w:cs="Times New Roman"/>
+        </w:rPr>
+        <w:t xml:space="preserve"> to create, update, and delete staff profiles</w:t>
+      </w:r>
+    </w:p>
+    <w:p>
+      <w:pPr>
+        <w:pStyle w:val="ListParagraph"/>
+        <w:numPr>
+          <w:ilvl w:val="0"/>
+          <w:numId w:val="1"/>
+        </w:numPr>
+        <w:spacing w:line="360" w:lineRule="auto"/>
+        <w:rPr>
+          <w:rFonts w:ascii="Times New Roman" w:hAnsi="Times New Roman" w:cs="Times New Roman"/>
+        </w:rPr>
+      </w:pPr>
+      <w:proofErr w:type="gramStart"/>
+      <w:r>
+        <w:rPr>
+          <w:rFonts w:ascii="Times New Roman" w:hAnsi="Times New Roman" w:cs="Times New Roman"/>
+        </w:rPr>
+        <w:t>Construct</w:t>
+      </w:r>
+      <w:proofErr w:type="gramEnd"/>
+      <w:r>
+        <w:rPr>
+          <w:rFonts w:ascii="Times New Roman" w:hAnsi="Times New Roman" w:cs="Times New Roman"/>
+        </w:rPr>
+        <w:t xml:space="preserve"> module for </w:t>
+      </w:r>
+      <w:proofErr w:type="gramStart"/>
+      <w:r>
+        <w:rPr>
+          <w:rFonts w:ascii="Times New Roman" w:hAnsi="Times New Roman" w:cs="Times New Roman"/>
+        </w:rPr>
+        <w:t>manager</w:t>
+      </w:r>
+      <w:proofErr w:type="gramEnd"/>
+      <w:r>
+        <w:rPr>
+          <w:rFonts w:ascii="Times New Roman" w:hAnsi="Times New Roman" w:cs="Times New Roman"/>
+        </w:rPr>
+        <w:t xml:space="preserve"> to assign shifts</w:t>
+      </w:r>
+    </w:p>
+    <w:p>
+      <w:pPr>
+        <w:pStyle w:val="ListParagraph"/>
+        <w:numPr>
+          <w:ilvl w:val="0"/>
+          <w:numId w:val="1"/>
+        </w:numPr>
+        <w:spacing w:line="360" w:lineRule="auto"/>
+        <w:rPr>
+          <w:rFonts w:ascii="Times New Roman" w:hAnsi="Times New Roman" w:cs="Times New Roman"/>
+        </w:rPr>
+      </w:pPr>
+      <w:r>
+        <w:rPr>
+          <w:rFonts w:ascii="Times New Roman" w:hAnsi="Times New Roman" w:cs="Times New Roman"/>
+        </w:rPr>
+        <w:t xml:space="preserve">Construct module for </w:t>
+      </w:r>
+      <w:proofErr w:type="gramStart"/>
+      <w:r>
+        <w:rPr>
+          <w:rFonts w:ascii="Times New Roman" w:hAnsi="Times New Roman" w:cs="Times New Roman"/>
+        </w:rPr>
+        <w:t>manager</w:t>
+      </w:r>
+      <w:proofErr w:type="gramEnd"/>
+      <w:r>
+        <w:rPr>
+          <w:rFonts w:ascii="Times New Roman" w:hAnsi="Times New Roman" w:cs="Times New Roman"/>
+        </w:rPr>
+        <w:t xml:space="preserve"> to assign waiters to tables</w:t>
+      </w:r>
+    </w:p>
+    <w:p>
+      <w:pPr>
+        <w:spacing w:line="360" w:lineRule="auto"/>
+        <w:ind w:left="720"/>
+        <w:rPr>
+          <w:rFonts w:ascii="Times New Roman" w:hAnsi="Times New Roman" w:cs="Times New Roman"/>
+        </w:rPr>
+      </w:pPr>
+      <w:r>
+        <w:rPr>
+          <w:rFonts w:ascii="Times New Roman" w:hAnsi="Times New Roman" w:cs="Times New Roman"/>
+          <w:i/>
+          <w:iCs/>
+        </w:rPr>
+        <w:lastRenderedPageBreak/>
+        <w:t>Revenue Management</w:t>
+      </w:r>
+      <w:r>
+        <w:rPr>
+          <w:rFonts w:ascii="Times New Roman" w:hAnsi="Times New Roman" w:cs="Times New Roman"/>
+          <w:i/>
+          <w:iCs/>
+        </w:rPr>
+        <w:t xml:space="preserve"> (R</w:t>
+      </w:r>
+      <w:r>
+        <w:rPr>
+          <w:rFonts w:ascii="Times New Roman" w:hAnsi="Times New Roman" w:cs="Times New Roman"/>
+          <w:i/>
+          <w:iCs/>
+        </w:rPr>
+        <w:t>e</w:t>
+      </w:r>
+      <w:r>
+        <w:rPr>
+          <w:rFonts w:ascii="Times New Roman" w:hAnsi="Times New Roman" w:cs="Times New Roman"/>
+          <w:i/>
+          <w:iCs/>
+        </w:rPr>
+        <w:t>)</w:t>
+      </w:r>
+    </w:p>
+    <w:p>
+      <w:pPr>
+        <w:pStyle w:val="ListParagraph"/>
+        <w:numPr>
+          <w:ilvl w:val="0"/>
+          <w:numId w:val="1"/>
+        </w:numPr>
+        <w:spacing w:line="360" w:lineRule="auto"/>
+        <w:rPr>
+          <w:rFonts w:ascii="Times New Roman" w:hAnsi="Times New Roman" w:cs="Times New Roman"/>
+        </w:rPr>
+      </w:pPr>
+      <w:r>
+        <w:rPr>
+          <w:rFonts w:ascii="Times New Roman" w:hAnsi="Times New Roman" w:cs="Times New Roman"/>
+        </w:rPr>
+        <w:t xml:space="preserve">Construct module(s) for </w:t>
+      </w:r>
+      <w:proofErr w:type="gramStart"/>
+      <w:r>
+        <w:rPr>
+          <w:rFonts w:ascii="Times New Roman" w:hAnsi="Times New Roman" w:cs="Times New Roman"/>
+        </w:rPr>
+        <w:t>waiter</w:t>
+      </w:r>
+      <w:proofErr w:type="gramEnd"/>
+      <w:r>
+        <w:rPr>
+          <w:rFonts w:ascii="Times New Roman" w:hAnsi="Times New Roman" w:cs="Times New Roman"/>
+        </w:rPr>
+        <w:t xml:space="preserve"> to send refund </w:t>
+      </w:r>
+      <w:proofErr w:type="gramStart"/>
+      <w:r>
+        <w:rPr>
+          <w:rFonts w:ascii="Times New Roman" w:hAnsi="Times New Roman" w:cs="Times New Roman"/>
+        </w:rPr>
+        <w:t>request</w:t>
+      </w:r>
+      <w:proofErr w:type="gramEnd"/>
+      <w:r>
+        <w:rPr>
+          <w:rFonts w:ascii="Times New Roman" w:hAnsi="Times New Roman" w:cs="Times New Roman"/>
+        </w:rPr>
+        <w:t xml:space="preserve"> and </w:t>
+      </w:r>
+      <w:proofErr w:type="gramStart"/>
+      <w:r>
+        <w:rPr>
+          <w:rFonts w:ascii="Times New Roman" w:hAnsi="Times New Roman" w:cs="Times New Roman"/>
+        </w:rPr>
+        <w:t>manager</w:t>
+      </w:r>
+      <w:proofErr w:type="gramEnd"/>
+      <w:r>
+        <w:rPr>
+          <w:rFonts w:ascii="Times New Roman" w:hAnsi="Times New Roman" w:cs="Times New Roman"/>
+        </w:rPr>
+        <w:t xml:space="preserve"> to approve or deny</w:t>
+      </w:r>
+    </w:p>
+    <w:p>
+      <w:pPr>
+        <w:pStyle w:val="ListParagraph"/>
+        <w:numPr>
+          <w:ilvl w:val="0"/>
+          <w:numId w:val="1"/>
+        </w:numPr>
+        <w:spacing w:line="360" w:lineRule="auto"/>
+        <w:rPr>
+          <w:rFonts w:ascii="Times New Roman" w:hAnsi="Times New Roman" w:cs="Times New Roman"/>
+        </w:rPr>
+      </w:pPr>
+      <w:r>
+        <w:rPr>
+          <w:rFonts w:ascii="Times New Roman" w:hAnsi="Times New Roman" w:cs="Times New Roman"/>
+        </w:rPr>
+        <w:t xml:space="preserve">Construct module to accept customer payment for order (card </w:t>
+      </w:r>
+      <w:r>
+        <w:rPr>
+          <w:rFonts w:ascii="Times New Roman" w:hAnsi="Times New Roman" w:cs="Times New Roman"/>
+        </w:rPr>
+        <w:t>or cash options</w:t>
+      </w:r>
+      <w:r>
+        <w:rPr>
+          <w:rFonts w:ascii="Times New Roman" w:hAnsi="Times New Roman" w:cs="Times New Roman"/>
+        </w:rPr>
+        <w:t>)</w:t>
+      </w:r>
+    </w:p>
+    <w:p>
+      <w:pPr>
+        <w:spacing w:line="360" w:lineRule="auto"/>
+        <w:ind w:left="720"/>
+        <w:rPr>
+          <w:rFonts w:ascii="Times New Roman" w:hAnsi="Times New Roman" w:cs="Times New Roman"/>
+          <w:i/>
+          <w:iCs/>
+        </w:rPr>
+      </w:pPr>
+      <w:r>
+        <w:rPr>
+          <w:rFonts w:ascii="Times New Roman" w:hAnsi="Times New Roman" w:cs="Times New Roman"/>
+          <w:i/>
+          <w:iCs/>
+        </w:rPr>
+        <w:t>Restaurant</w:t>
+      </w:r>
+      <w:r>
+        <w:rPr>
+          <w:rFonts w:ascii="Times New Roman" w:hAnsi="Times New Roman" w:cs="Times New Roman"/>
+          <w:i/>
+          <w:iCs/>
+        </w:rPr>
+        <w:t xml:space="preserve"> Management</w:t>
+      </w:r>
+      <w:r>
+        <w:rPr>
+          <w:rFonts w:ascii="Times New Roman" w:hAnsi="Times New Roman" w:cs="Times New Roman"/>
+          <w:i/>
+          <w:iCs/>
+        </w:rPr>
+        <w:t xml:space="preserve"> (</w:t>
+      </w:r>
+      <w:r>
+        <w:rPr>
+          <w:rFonts w:ascii="Times New Roman" w:hAnsi="Times New Roman" w:cs="Times New Roman"/>
+          <w:i/>
+          <w:iCs/>
+        </w:rPr>
+        <w:t>Rt</w:t>
+      </w:r>
+      <w:r>
+        <w:rPr>
+          <w:rFonts w:ascii="Times New Roman" w:hAnsi="Times New Roman" w:cs="Times New Roman"/>
+          <w:i/>
+          <w:iCs/>
+        </w:rPr>
+        <w:t>)</w:t>
+      </w:r>
+    </w:p>
+    <w:p>
+      <w:pPr>
+        <w:pStyle w:val="ListParagraph"/>
+        <w:numPr>
+          <w:ilvl w:val="0"/>
+          <w:numId w:val="1"/>
+        </w:numPr>
+        <w:spacing w:line="360" w:lineRule="auto"/>
+        <w:rPr>
+          <w:rFonts w:ascii="Times New Roman" w:hAnsi="Times New Roman" w:cs="Times New Roman"/>
+        </w:rPr>
+      </w:pPr>
+      <w:r>
+        <w:rPr>
+          <w:rFonts w:ascii="Times New Roman" w:hAnsi="Times New Roman" w:cs="Times New Roman"/>
+        </w:rPr>
+        <w:t xml:space="preserve">Construct module for </w:t>
+      </w:r>
+      <w:proofErr w:type="gramStart"/>
+      <w:r>
+        <w:rPr>
+          <w:rFonts w:ascii="Times New Roman" w:hAnsi="Times New Roman" w:cs="Times New Roman"/>
+        </w:rPr>
+        <w:t>manager</w:t>
+      </w:r>
+      <w:proofErr w:type="gramEnd"/>
+      <w:r>
+        <w:rPr>
+          <w:rFonts w:ascii="Times New Roman" w:hAnsi="Times New Roman" w:cs="Times New Roman"/>
+        </w:rPr>
+        <w:t xml:space="preserve"> to view inventory and order supplies</w:t>
+      </w:r>
+    </w:p>
+    <w:p>
+      <w:pPr>
+        <w:pStyle w:val="ListParagraph"/>
+        <w:numPr>
+          <w:ilvl w:val="0"/>
+          <w:numId w:val="1"/>
+        </w:numPr>
+        <w:spacing w:line="360" w:lineRule="auto"/>
+        <w:rPr>
+          <w:rFonts w:ascii="Times New Roman" w:hAnsi="Times New Roman" w:cs="Times New Roman"/>
+        </w:rPr>
+      </w:pPr>
+      <w:r>
+        <w:rPr>
+          <w:rFonts w:ascii="Times New Roman" w:hAnsi="Times New Roman" w:cs="Times New Roman"/>
+        </w:rPr>
+        <w:t xml:space="preserve">Construct module for </w:t>
+      </w:r>
+      <w:proofErr w:type="gramStart"/>
+      <w:r>
+        <w:rPr>
+          <w:rFonts w:ascii="Times New Roman" w:hAnsi="Times New Roman" w:cs="Times New Roman"/>
+        </w:rPr>
+        <w:t>manager</w:t>
+      </w:r>
+      <w:proofErr w:type="gramEnd"/>
+      <w:r>
+        <w:rPr>
+          <w:rFonts w:ascii="Times New Roman" w:hAnsi="Times New Roman" w:cs="Times New Roman"/>
+        </w:rPr>
+        <w:t xml:space="preserve"> to set minimum amounts for inventory items and receive notifications when the amount is reached</w:t>
+      </w:r>
+    </w:p>
+    <w:p>
+      <w:pPr>
+        <w:pStyle w:val="ListParagraph"/>
+        <w:numPr>
+          <w:ilvl w:val="0"/>
+          <w:numId w:val="1"/>
+        </w:numPr>
+        <w:spacing w:line="360" w:lineRule="auto"/>
+        <w:rPr>
+          <w:rFonts w:ascii="Times New Roman" w:hAnsi="Times New Roman" w:cs="Times New Roman"/>
+        </w:rPr>
+      </w:pPr>
+      <w:r>
+        <w:rPr>
+          <w:rFonts w:ascii="Times New Roman" w:hAnsi="Times New Roman" w:cs="Times New Roman"/>
+        </w:rPr>
+        <w:t xml:space="preserve">Construct module for </w:t>
+      </w:r>
+      <w:proofErr w:type="gramStart"/>
+      <w:r>
+        <w:rPr>
+          <w:rFonts w:ascii="Times New Roman" w:hAnsi="Times New Roman" w:cs="Times New Roman"/>
+        </w:rPr>
+        <w:t>manager</w:t>
+      </w:r>
+      <w:proofErr w:type="gramEnd"/>
+      <w:r>
+        <w:rPr>
+          <w:rFonts w:ascii="Times New Roman" w:hAnsi="Times New Roman" w:cs="Times New Roman"/>
+        </w:rPr>
+        <w:t xml:space="preserve"> to update menu items and prices</w:t>
+      </w:r>
+    </w:p>
+    <w:p>
+      <w:pPr>
+        <w:spacing w:line="360" w:lineRule="auto"/>
+        <w:ind w:left="720"/>
+        <w:rPr>
+          <w:rFonts w:ascii="Times New Roman" w:hAnsi="Times New Roman" w:cs="Times New Roman"/>
+        </w:rPr>
+      </w:pPr>
+      <w:r>
+        <w:rPr>
+          <w:rFonts w:ascii="Times New Roman" w:hAnsi="Times New Roman" w:cs="Times New Roman"/>
+          <w:i/>
+          <w:iCs/>
+        </w:rPr>
+        <w:t>Performance Requirements</w:t>
+      </w:r>
+    </w:p>
+    <w:p>
+      <w:pPr>
+        <w:pStyle w:val="ListParagraph"/>
+        <w:numPr>
+          <w:ilvl w:val="0"/>
+          <w:numId w:val="1"/>
+        </w:numPr>
+        <w:spacing w:line="360" w:lineRule="auto"/>
+        <w:rPr>
+          <w:rFonts w:ascii="Times New Roman" w:hAnsi="Times New Roman" w:cs="Times New Roman"/>
+        </w:rPr>
+      </w:pPr>
+      <w:r>
+        <w:rPr>
+          <w:rFonts w:ascii="Times New Roman" w:hAnsi="Times New Roman" w:cs="Times New Roman"/>
+        </w:rPr>
+        <w:t xml:space="preserve">Estimate number total of </w:t>
+      </w:r>
+      <w:proofErr w:type="gramStart"/>
+      <w:r>
+        <w:rPr>
+          <w:rFonts w:ascii="Times New Roman" w:hAnsi="Times New Roman" w:cs="Times New Roman"/>
+        </w:rPr>
+        <w:t>key strokes</w:t>
+      </w:r>
+      <w:proofErr w:type="gramEnd"/>
+      <w:r>
+        <w:rPr>
+          <w:rFonts w:ascii="Times New Roman" w:hAnsi="Times New Roman" w:cs="Times New Roman"/>
+        </w:rPr>
+        <w:t>/clicks</w:t>
+      </w:r>
+    </w:p>
+    <w:p>
+      <w:pPr>
+        <w:pStyle w:val="ListParagraph"/>
+        <w:numPr>
+          <w:ilvl w:val="0"/>
+          <w:numId w:val="1"/>
+        </w:numPr>
+        <w:spacing w:line="360" w:lineRule="auto"/>
+        <w:rPr>
+          <w:rFonts w:ascii="Times New Roman" w:hAnsi="Times New Roman" w:cs="Times New Roman"/>
+        </w:rPr>
+      </w:pPr>
+      <w:r>
+        <w:rPr>
+          <w:rFonts w:ascii="Times New Roman" w:hAnsi="Times New Roman" w:cs="Times New Roman"/>
+        </w:rPr>
+        <w:t xml:space="preserve">Review actual number of total </w:t>
+      </w:r>
+      <w:proofErr w:type="gramStart"/>
+      <w:r>
+        <w:rPr>
+          <w:rFonts w:ascii="Times New Roman" w:hAnsi="Times New Roman" w:cs="Times New Roman"/>
+        </w:rPr>
+        <w:t>key strokes</w:t>
+      </w:r>
+      <w:proofErr w:type="gramEnd"/>
+      <w:r>
+        <w:rPr>
+          <w:rFonts w:ascii="Times New Roman" w:hAnsi="Times New Roman" w:cs="Times New Roman"/>
+        </w:rPr>
+        <w:t>/clicks and compare to estimate; evaluate possible reductions</w:t>
+      </w:r>
+    </w:p>
+    <w:p>
+      <w:pPr>
+        <w:pStyle w:val="ListParagraph"/>
+        <w:numPr>
+          <w:ilvl w:val="0"/>
+          <w:numId w:val="1"/>
+        </w:numPr>
+        <w:spacing w:line="360" w:lineRule="auto"/>
+        <w:rPr>
+          <w:rFonts w:ascii="Times New Roman" w:hAnsi="Times New Roman" w:cs="Times New Roman"/>
+        </w:rPr>
+      </w:pPr>
+      <w:r>
+        <w:rPr>
+          <w:rFonts w:ascii="Times New Roman" w:hAnsi="Times New Roman" w:cs="Times New Roman"/>
+        </w:rPr>
+        <w:t>Estimate possible methods of security breach</w:t>
+      </w:r>
+    </w:p>
+    <w:p>
+      <w:pPr>
+        <w:pStyle w:val="ListParagraph"/>
+        <w:numPr>
+          <w:ilvl w:val="0"/>
+          <w:numId w:val="1"/>
+        </w:numPr>
+        <w:spacing w:line="360" w:lineRule="auto"/>
+        <w:rPr>
+          <w:rFonts w:ascii="Times New Roman" w:hAnsi="Times New Roman" w:cs="Times New Roman"/>
+        </w:rPr>
+      </w:pPr>
+      <w:r>
+        <w:rPr>
+          <w:rFonts w:ascii="Times New Roman" w:hAnsi="Times New Roman" w:cs="Times New Roman"/>
+        </w:rPr>
+        <w:t>Test and ensure minimum of 90% failure to breach implemented system security</w:t>
+      </w:r>
+    </w:p>
+    <w:p>
+      <w:pPr>
+        <w:pStyle w:val="ListParagraph"/>
+        <w:numPr>
+          <w:ilvl w:val="0"/>
+          <w:numId w:val="1"/>
+        </w:numPr>
+        <w:spacing w:line="360" w:lineRule="auto"/>
+        <w:rPr>
+          <w:rFonts w:ascii="Times New Roman" w:hAnsi="Times New Roman" w:cs="Times New Roman"/>
+        </w:rPr>
+      </w:pPr>
+      <w:r>
+        <w:rPr>
+          <w:rFonts w:ascii="Times New Roman" w:hAnsi="Times New Roman" w:cs="Times New Roman"/>
+        </w:rPr>
+        <w:t>Construct module to ensure user passwords are accessible only to the system and only for identity verification</w:t>
+      </w:r>
+    </w:p>
+    <w:p>
+      <w:pPr>
+        <w:pStyle w:val="ListParagraph"/>
+        <w:numPr>
+          <w:ilvl w:val="0"/>
+          <w:numId w:val="1"/>
+        </w:numPr>
+        <w:spacing w:line="360" w:lineRule="auto"/>
+        <w:rPr>
+          <w:rFonts w:ascii="Times New Roman" w:hAnsi="Times New Roman" w:cs="Times New Roman"/>
+        </w:rPr>
+      </w:pPr>
+      <w:r>
+        <w:rPr>
+          <w:rFonts w:ascii="Times New Roman" w:hAnsi="Times New Roman" w:cs="Times New Roman"/>
+        </w:rPr>
+        <w:t>Construct a user manual</w:t>
+      </w:r>
+    </w:p>
+    <w:p>
+      <w:pPr>
+        <w:pStyle w:val="ListParagraph"/>
+        <w:numPr>
+          <w:ilvl w:val="0"/>
+          <w:numId w:val="1"/>
+        </w:numPr>
+        <w:spacing w:line="360" w:lineRule="auto"/>
+        <w:rPr>
+          <w:rFonts w:ascii="Times New Roman" w:hAnsi="Times New Roman" w:cs="Times New Roman"/>
+        </w:rPr>
+      </w:pPr>
+      <w:r>
+        <w:rPr>
+          <w:rFonts w:ascii="Times New Roman" w:hAnsi="Times New Roman" w:cs="Times New Roman"/>
+        </w:rPr>
+        <w:t>Test for user ability to easily navigate through the system</w:t>
+      </w:r>
+    </w:p>
+    <w:p>
+      <w:pPr>
+        <w:spacing w:line="360" w:lineRule="auto"/>
+        <w:rPr>
+          <w:rFonts w:ascii="Times New Roman" w:hAnsi="Times New Roman" w:cs="Times New Roman"/>
+        </w:rPr>
+      </w:pPr>
+    </w:p>
+    <w:p>
+      <w:pPr>
+        <w:spacing w:line="360" w:lineRule="auto"/>
+        <w:ind w:left="720"/>
+        <w:rPr>
+          <w:rFonts w:ascii="Times New Roman" w:hAnsi="Times New Roman" w:cs="Times New Roman"/>
+          <w:b/>
+          <w:bCs/>
+        </w:rPr>
+      </w:pPr>
+      <w:r>
+        <w:rPr>
+          <w:rFonts w:ascii="Times New Roman" w:hAnsi="Times New Roman" w:cs="Times New Roman"/>
+          <w:b/>
+          <w:bCs/>
+          <w:i/>
+          <w:iCs/>
+        </w:rPr>
+        <w:t>Requirement ID Formatting</w:t>
+      </w:r>
+    </w:p>
+    <w:p>
+      <w:pPr>
+        <w:spacing w:line="360" w:lineRule="auto"/>
+        <w:ind w:left="720"/>
+        <w:rPr>
+          <w:rFonts w:ascii="Times New Roman" w:hAnsi="Times New Roman" w:cs="Times New Roman"/>
+        </w:rPr>
+      </w:pPr>
+      <w:r>
+        <w:rPr>
+          <w:rFonts w:ascii="Times New Roman" w:hAnsi="Times New Roman" w:cs="Times New Roman"/>
+        </w:rPr>
+        <w:tab/>
+      </w:r>
+      <w:proofErr w:type="spellStart"/>
+      <w:r>
+        <w:rPr>
+          <w:rFonts w:ascii="Times New Roman" w:hAnsi="Times New Roman" w:cs="Times New Roman"/>
+        </w:rPr>
+        <w:t>BusinessFlowLetter</w:t>
+      </w:r>
+      <w:proofErr w:type="spellEnd"/>
+      <w:r>
+        <w:rPr>
+          <w:rFonts w:ascii="Times New Roman" w:hAnsi="Times New Roman" w:cs="Times New Roman"/>
+        </w:rPr>
+        <w:t xml:space="preserve">. </w:t>
+      </w:r>
+      <w:proofErr w:type="spellStart"/>
+      <w:r>
+        <w:rPr>
+          <w:rFonts w:ascii="Times New Roman" w:hAnsi="Times New Roman" w:cs="Times New Roman"/>
+        </w:rPr>
+        <w:t>RoleLetter</w:t>
+      </w:r>
+      <w:proofErr w:type="spellEnd"/>
+      <w:r>
+        <w:rPr>
+          <w:rFonts w:ascii="Times New Roman" w:hAnsi="Times New Roman" w:cs="Times New Roman"/>
+        </w:rPr>
+        <w:t>(s</w:t>
+      </w:r>
+      <w:proofErr w:type="gramStart"/>
+      <w:r>
+        <w:rPr>
+          <w:rFonts w:ascii="Times New Roman" w:hAnsi="Times New Roman" w:cs="Times New Roman"/>
+        </w:rPr>
+        <w:t>).Number</w:t>
+      </w:r>
+      <w:proofErr w:type="gramEnd"/>
+      <w:r>
+        <w:rPr>
+          <w:rFonts w:ascii="Times New Roman" w:hAnsi="Times New Roman" w:cs="Times New Roman"/>
+        </w:rPr>
+        <w:t xml:space="preserve">  </w:t>
+      </w:r>
+      <w:proofErr w:type="gramStart"/>
+      <w:r>
+        <w:rPr>
+          <w:rFonts w:ascii="Times New Roman" w:hAnsi="Times New Roman" w:cs="Times New Roman"/>
+        </w:rPr>
+        <w:t xml:space="preserve">or  </w:t>
+      </w:r>
+      <w:proofErr w:type="spellStart"/>
+      <w:r>
+        <w:rPr>
+          <w:rFonts w:ascii="Times New Roman" w:hAnsi="Times New Roman" w:cs="Times New Roman"/>
+        </w:rPr>
+        <w:t>BusinessFlowLetter</w:t>
+      </w:r>
+      <w:proofErr w:type="spellEnd"/>
+      <w:proofErr w:type="gramEnd"/>
+      <w:r>
+        <w:rPr>
+          <w:rFonts w:ascii="Times New Roman" w:hAnsi="Times New Roman" w:cs="Times New Roman"/>
+        </w:rPr>
+        <w:t xml:space="preserve">. </w:t>
+      </w:r>
+      <w:proofErr w:type="spellStart"/>
+      <w:r>
+        <w:rPr>
+          <w:rFonts w:ascii="Times New Roman" w:hAnsi="Times New Roman" w:cs="Times New Roman"/>
+        </w:rPr>
+        <w:t>RoleLetter</w:t>
+      </w:r>
+      <w:proofErr w:type="spellEnd"/>
+      <w:r>
+        <w:rPr>
+          <w:rFonts w:ascii="Times New Roman" w:hAnsi="Times New Roman" w:cs="Times New Roman"/>
+        </w:rPr>
+        <w:t>(s</w:t>
+      </w:r>
+      <w:proofErr w:type="gramStart"/>
+      <w:r>
+        <w:rPr>
+          <w:rFonts w:ascii="Times New Roman" w:hAnsi="Times New Roman" w:cs="Times New Roman"/>
+        </w:rPr>
+        <w:t>).</w:t>
+      </w:r>
+      <w:proofErr w:type="spellStart"/>
+      <w:r>
+        <w:rPr>
+          <w:rFonts w:ascii="Times New Roman" w:hAnsi="Times New Roman" w:cs="Times New Roman"/>
+        </w:rPr>
+        <w:t>Number</w:t>
+      </w:r>
+      <w:r>
+        <w:rPr>
+          <w:rFonts w:ascii="Times New Roman" w:hAnsi="Times New Roman" w:cs="Times New Roman"/>
+        </w:rPr>
+        <w:t>.PartLetter</w:t>
+      </w:r>
+      <w:proofErr w:type="spellEnd"/>
+      <w:proofErr w:type="gramEnd"/>
+    </w:p>
+    <w:p>
+      <w:pPr>
+        <w:spacing w:line="360" w:lineRule="auto"/>
+        <w:ind w:left="720"/>
+        <w:rPr>
+          <w:rFonts w:ascii="Times New Roman" w:hAnsi="Times New Roman" w:cs="Times New Roman"/>
+        </w:rPr>
+      </w:pPr>
+    </w:p>
+    <w:p>
+      <w:pPr>
+        <w:spacing w:line="360" w:lineRule="auto"/>
+        <w:ind w:left="720"/>
+        <w:rPr>
+          <w:rFonts w:ascii="Times New Roman" w:hAnsi="Times New Roman" w:cs="Times New Roman"/>
+        </w:rPr>
+      </w:pPr>
+      <w:r>
+        <w:rPr>
+          <w:rFonts w:ascii="Times New Roman" w:hAnsi="Times New Roman" w:cs="Times New Roman"/>
+        </w:rPr>
+        <w:tab/>
+        <w:t>Roles-</w:t>
+      </w:r>
+    </w:p>
+    <w:p>
+      <w:pPr>
+        <w:pStyle w:val="ListParagraph"/>
+        <w:numPr>
+          <w:ilvl w:val="0"/>
+          <w:numId w:val="1"/>
+        </w:numPr>
+        <w:spacing w:line="360" w:lineRule="auto"/>
+        <w:rPr>
+          <w:rFonts w:ascii="Times New Roman" w:hAnsi="Times New Roman" w:cs="Times New Roman"/>
+        </w:rPr>
+      </w:pPr>
+      <w:r>
+        <w:rPr>
+          <w:rFonts w:ascii="Times New Roman" w:hAnsi="Times New Roman" w:cs="Times New Roman"/>
+        </w:rPr>
+        <w:lastRenderedPageBreak/>
+        <w:t>Cook (C), Manager (M), Waiter (W), Busboy (B)</w:t>
+      </w:r>
+    </w:p>
+    <w:p>
+      <w:pPr>
+        <w:pStyle w:val="ListParagraph"/>
+        <w:numPr>
+          <w:ilvl w:val="1"/>
+          <w:numId w:val="1"/>
+        </w:numPr>
+        <w:spacing w:line="360" w:lineRule="auto"/>
+        <w:rPr>
+          <w:rFonts w:ascii="Times New Roman" w:hAnsi="Times New Roman" w:cs="Times New Roman"/>
+        </w:rPr>
+      </w:pPr>
+      <w:r>
+        <w:rPr>
+          <w:rFonts w:ascii="Times New Roman" w:hAnsi="Times New Roman" w:cs="Times New Roman"/>
+        </w:rPr>
+        <w:t>Suggests the requirement primarily relates to one of these roles, such as table or staff management.</w:t>
+      </w:r>
+    </w:p>
+    <w:p>
+      <w:pPr>
+        <w:pStyle w:val="ListParagraph"/>
+        <w:numPr>
+          <w:ilvl w:val="0"/>
+          <w:numId w:val="1"/>
+        </w:numPr>
+        <w:spacing w:line="360" w:lineRule="auto"/>
+        <w:rPr>
+          <w:rFonts w:ascii="Times New Roman" w:hAnsi="Times New Roman" w:cs="Times New Roman"/>
+        </w:rPr>
+      </w:pPr>
+      <w:r>
+        <w:rPr>
+          <w:rFonts w:ascii="Times New Roman" w:hAnsi="Times New Roman" w:cs="Times New Roman"/>
+        </w:rPr>
+        <w:t>System (S)</w:t>
+      </w:r>
+    </w:p>
+    <w:p>
+      <w:pPr>
+        <w:pStyle w:val="ListParagraph"/>
+        <w:numPr>
+          <w:ilvl w:val="1"/>
+          <w:numId w:val="1"/>
+        </w:numPr>
+        <w:spacing w:line="360" w:lineRule="auto"/>
+        <w:rPr>
+          <w:rFonts w:ascii="Times New Roman" w:hAnsi="Times New Roman" w:cs="Times New Roman"/>
+        </w:rPr>
+      </w:pPr>
+      <w:r>
+        <w:rPr>
+          <w:rFonts w:ascii="Times New Roman" w:hAnsi="Times New Roman" w:cs="Times New Roman"/>
+        </w:rPr>
+        <w:t>Suggests the requirement primarily relates to the system, such as data collection, or effects all staff, such as login.</w:t>
+      </w:r>
+    </w:p>
+    <w:p>
+      <w:pPr>
+        <w:pStyle w:val="ListParagraph"/>
+        <w:numPr>
+          <w:ilvl w:val="0"/>
+          <w:numId w:val="1"/>
+        </w:numPr>
+        <w:spacing w:line="360" w:lineRule="auto"/>
+        <w:rPr>
+          <w:rFonts w:ascii="Times New Roman" w:hAnsi="Times New Roman" w:cs="Times New Roman"/>
+        </w:rPr>
+      </w:pPr>
+      <w:r>
+        <w:rPr>
+          <w:rFonts w:ascii="Times New Roman" w:hAnsi="Times New Roman" w:cs="Times New Roman"/>
+        </w:rPr>
+        <w:t>Customer (C)</w:t>
+      </w:r>
+    </w:p>
+    <w:p>
+      <w:pPr>
+        <w:pStyle w:val="ListParagraph"/>
+        <w:numPr>
+          <w:ilvl w:val="1"/>
+          <w:numId w:val="1"/>
+        </w:numPr>
+        <w:spacing w:line="360" w:lineRule="auto"/>
+        <w:rPr>
+          <w:rFonts w:ascii="Times New Roman" w:hAnsi="Times New Roman" w:cs="Times New Roman"/>
+        </w:rPr>
+      </w:pPr>
+      <w:r>
+        <w:rPr>
+          <w:rFonts w:ascii="Times New Roman" w:hAnsi="Times New Roman" w:cs="Times New Roman"/>
+        </w:rPr>
+        <w:t>Suggests the requirement requires direct customer interaction, such as payment.</w:t>
+      </w:r>
+    </w:p>
+    <w:p>
+      <w:pPr>
+        <w:spacing w:line="360" w:lineRule="auto"/>
+        <w:ind w:left="720"/>
+        <w:rPr>
+          <w:rFonts w:ascii="Times New Roman" w:hAnsi="Times New Roman" w:cs="Times New Roman"/>
+        </w:rPr>
+      </w:pPr>
+      <w:r>
+        <w:rPr>
+          <w:rFonts w:ascii="Times New Roman" w:hAnsi="Times New Roman" w:cs="Times New Roman"/>
+        </w:rPr>
+        <w:tab/>
+        <w:t>Ex</w:t>
+      </w:r>
+      <w:r>
+        <w:rPr>
+          <w:rFonts w:ascii="Times New Roman" w:hAnsi="Times New Roman" w:cs="Times New Roman"/>
+        </w:rPr>
+        <w:t>amples-</w:t>
+      </w:r>
+    </w:p>
+    <w:p>
+      <w:pPr>
+        <w:pStyle w:val="ListParagraph"/>
+        <w:numPr>
+          <w:ilvl w:val="1"/>
+          <w:numId w:val="1"/>
+        </w:numPr>
+        <w:spacing w:line="360" w:lineRule="auto"/>
+        <w:rPr>
+          <w:rFonts w:ascii="Times New Roman" w:hAnsi="Times New Roman" w:cs="Times New Roman"/>
+        </w:rPr>
+      </w:pPr>
+      <w:r>
+        <w:rPr>
+          <w:rFonts w:ascii="Times New Roman" w:hAnsi="Times New Roman" w:cs="Times New Roman"/>
+        </w:rPr>
+        <w:t>S</w:t>
+      </w:r>
+      <w:r>
+        <w:rPr>
+          <w:rFonts w:ascii="Times New Roman" w:hAnsi="Times New Roman" w:cs="Times New Roman"/>
+        </w:rPr>
+        <w:t>A.S.3</w:t>
+      </w:r>
+      <w:r>
+        <w:rPr>
+          <w:rFonts w:ascii="Times New Roman" w:hAnsi="Times New Roman" w:cs="Times New Roman"/>
+        </w:rPr>
+        <w:t xml:space="preserve"> could represent that requirement “</w:t>
+      </w:r>
+      <w:r>
+        <w:rPr>
+          <w:rFonts w:ascii="Times New Roman" w:hAnsi="Times New Roman" w:cs="Times New Roman"/>
+        </w:rPr>
+        <w:t>Construct module to allow for user login</w:t>
+      </w:r>
+      <w:r>
+        <w:rPr>
+          <w:rFonts w:ascii="Times New Roman" w:hAnsi="Times New Roman" w:cs="Times New Roman"/>
+        </w:rPr>
+        <w:t>”</w:t>
+      </w:r>
+    </w:p>
+    <w:p>
+      <w:pPr>
+        <w:pStyle w:val="ListParagraph"/>
+        <w:numPr>
+          <w:ilvl w:val="1"/>
+          <w:numId w:val="1"/>
+        </w:numPr>
+        <w:spacing w:line="360" w:lineRule="auto"/>
+        <w:rPr>
+          <w:rFonts w:ascii="Times New Roman" w:hAnsi="Times New Roman" w:cs="Times New Roman"/>
+        </w:rPr>
+      </w:pPr>
+      <w:r>
+        <w:rPr>
+          <w:rFonts w:ascii="Times New Roman" w:hAnsi="Times New Roman" w:cs="Times New Roman"/>
+        </w:rPr>
+        <w:t>SM.S.2 could represent that requirement “</w:t>
+      </w:r>
+      <w:r>
+        <w:rPr>
+          <w:rFonts w:ascii="Times New Roman" w:hAnsi="Times New Roman" w:cs="Times New Roman"/>
+        </w:rPr>
+        <w:t>Construct module for clock-in/out</w:t>
+      </w:r>
+      <w:r>
+        <w:rPr>
+          <w:rFonts w:ascii="Times New Roman" w:hAnsi="Times New Roman" w:cs="Times New Roman"/>
+        </w:rPr>
+        <w:t>”</w:t>
+      </w:r>
+    </w:p>
+    <w:p>
+      <w:pPr>
+        <w:pStyle w:val="ListParagraph"/>
+        <w:numPr>
+          <w:ilvl w:val="1"/>
+          <w:numId w:val="1"/>
+        </w:numPr>
+        <w:spacing w:line="360" w:lineRule="auto"/>
+        <w:rPr>
+          <w:rFonts w:ascii="Times New Roman" w:hAnsi="Times New Roman" w:cs="Times New Roman"/>
+        </w:rPr>
+      </w:pPr>
+      <w:r>
+        <w:rPr>
+          <w:rFonts w:ascii="Times New Roman" w:hAnsi="Times New Roman" w:cs="Times New Roman"/>
+        </w:rPr>
+        <w:t>T.BW.</w:t>
+      </w:r>
+      <w:proofErr w:type="gramStart"/>
+      <w:r>
+        <w:rPr>
+          <w:rFonts w:ascii="Times New Roman" w:hAnsi="Times New Roman" w:cs="Times New Roman"/>
+        </w:rPr>
+        <w:t>1.a</w:t>
+      </w:r>
+      <w:proofErr w:type="gramEnd"/>
+      <w:r>
+        <w:rPr>
+          <w:rFonts w:ascii="Times New Roman" w:hAnsi="Times New Roman" w:cs="Times New Roman"/>
+        </w:rPr>
+        <w:t xml:space="preserve"> could represent the requirement “</w:t>
+      </w:r>
+      <w:r>
+        <w:rPr>
+          <w:rFonts w:ascii="Times New Roman" w:hAnsi="Times New Roman" w:cs="Times New Roman"/>
+        </w:rPr>
+        <w:t>Construct module for busboy</w:t>
+      </w:r>
+      <w:r>
+        <w:rPr>
+          <w:rFonts w:ascii="Times New Roman" w:hAnsi="Times New Roman" w:cs="Times New Roman"/>
+        </w:rPr>
+        <w:t>”</w:t>
+      </w:r>
+    </w:p>
+    <w:p>
+      <w:pPr>
+        <w:pStyle w:val="ListParagraph"/>
+        <w:numPr>
+          <w:ilvl w:val="1"/>
+          <w:numId w:val="1"/>
+        </w:numPr>
+        <w:spacing w:line="360" w:lineRule="auto"/>
+        <w:rPr>
+          <w:rFonts w:ascii="Times New Roman" w:hAnsi="Times New Roman" w:cs="Times New Roman"/>
+        </w:rPr>
+      </w:pPr>
+      <w:r>
+        <w:rPr>
+          <w:rFonts w:ascii="Times New Roman" w:hAnsi="Times New Roman" w:cs="Times New Roman"/>
+        </w:rPr>
+        <w:t>T.B</w:t>
+      </w:r>
+      <w:r>
+        <w:rPr>
+          <w:rFonts w:ascii="Times New Roman" w:hAnsi="Times New Roman" w:cs="Times New Roman"/>
+        </w:rPr>
+        <w:t>W</w:t>
+      </w:r>
+      <w:r>
+        <w:rPr>
+          <w:rFonts w:ascii="Times New Roman" w:hAnsi="Times New Roman" w:cs="Times New Roman"/>
+        </w:rPr>
+        <w:t>.</w:t>
+      </w:r>
+      <w:proofErr w:type="gramStart"/>
+      <w:r>
+        <w:rPr>
+          <w:rFonts w:ascii="Times New Roman" w:hAnsi="Times New Roman" w:cs="Times New Roman"/>
+        </w:rPr>
+        <w:t>1.a</w:t>
+      </w:r>
+      <w:proofErr w:type="gramEnd"/>
+      <w:r>
+        <w:rPr>
+          <w:rFonts w:ascii="Times New Roman" w:hAnsi="Times New Roman" w:cs="Times New Roman"/>
+        </w:rPr>
+        <w:t xml:space="preserve"> could represent the requirement “Construct module for </w:t>
+      </w:r>
+      <w:r>
+        <w:rPr>
+          <w:rFonts w:ascii="Times New Roman" w:hAnsi="Times New Roman" w:cs="Times New Roman"/>
+        </w:rPr>
+        <w:t>waiter</w:t>
+      </w:r>
+      <w:r>
+        <w:rPr>
+          <w:rFonts w:ascii="Times New Roman" w:hAnsi="Times New Roman" w:cs="Times New Roman"/>
+        </w:rPr>
+        <w:t>”</w:t>
+      </w:r>
+    </w:p>
     <w:sectPr>
+      <w:headerReference w:type="default" r:id="rId9"/>
       <w:pgSz w:w="12240" w:h="15840"/>
       <w:pgMar w:top="1440" w:right="1440" w:bottom="1440" w:left="1440" w:header="720" w:footer="720" w:gutter="0"/>
       <w:cols w:space="720"/>
@@ -985,30 +3059,235 @@
 </w:document>
 </file>
 
+<file path=word/endnotes.xml><?xml version="1.0" encoding="utf-8"?>
+<w:endnotes xmlns:wpc="http://schemas.microsoft.com/office/word/2010/wordprocessingCanvas" xmlns:cx="http://schemas.microsoft.com/office/drawing/2014/chartex" xmlns:cx1="http://schemas.microsoft.com/office/drawing/2015/9/8/chartex" xmlns:cx2="http://schemas.microsoft.com/office/drawing/2015/10/21/chartex" xmlns:cx3="http://schemas.microsoft.com/office/drawing/2016/5/9/chartex" xmlns:cx4="http://schemas.microsoft.com/office/drawing/2016/5/10/chartex" xmlns:cx5="http://schemas.microsoft.com/office/drawing/2016/5/11/chartex" xmlns:cx6="http://schemas.microsoft.com/office/drawing/2016/5/12/chartex" xmlns:cx7="http://schemas.microsoft.com/office/drawing/2016/5/13/chartex" xmlns:cx8="http://schemas.microsoft.com/office/drawing/2016/5/14/chartex" xmlns:mc="http://schemas.openxmlformats.org/markup-compatibility/2006" xmlns:aink="http://schemas.microsoft.com/office/drawing/2016/ink" xmlns:am3d="http://schemas.microsoft.com/office/drawing/2017/model3d" xmlns:o="urn:schemas-microsoft-com:office:office" xmlns:oel="http://schemas.microsoft.com/office/2019/extlst" xmlns:r="http://schemas.openxmlformats.org/officeDocument/2006/relationships" xmlns:m="http://schemas.openxmlformats.org/officeDocument/2006/math" xmlns:v="urn:schemas-microsoft-com:vml" xmlns:wp14="http://schemas.microsoft.com/office/word/2010/wordprocessingDrawing" xmlns:wp="http://schemas.openxmlformats.org/drawingml/2006/wordprocessingDrawing" xmlns:w10="urn:schemas-microsoft-com:office:word" xmlns:w="http://schemas.openxmlformats.org/wordprocessingml/2006/main" xmlns:w14="http://schemas.microsoft.com/office/word/2010/wordml" xmlns:w15="http://schemas.microsoft.com/office/word/2012/wordml" xmlns:w16cex="http://schemas.microsoft.com/office/word/2018/wordml/cex" xmlns:w16cid="http://schemas.microsoft.com/office/word/2016/wordml/cid" xmlns:w16="http://schemas.microsoft.com/office/word/2018/wordml" xmlns:w16du="http://schemas.microsoft.com/office/word/2023/wordml/word16du" xmlns:w16sdtdh="http://schemas.microsoft.com/office/word/2020/wordml/sdtdatahash" xmlns:w16sdtfl="http://schemas.microsoft.com/office/word/2024/wordml/sdtformatlock" xmlns:w16se="http://schemas.microsoft.com/office/word/2015/wordml/symex" xmlns:wpg="http://schemas.microsoft.com/office/word/2010/wordprocessingGroup" xmlns:wpi="http://schemas.microsoft.com/office/word/2010/wordprocessingInk" xmlns:wne="http://schemas.microsoft.com/office/word/2006/wordml" xmlns:wps="http://schemas.microsoft.com/office/word/2010/wordprocessingShape" mc:Ignorable="w14 w15 w16se w16cid w16 w16cex w16sdtdh w16sdtfl w16du wp14">
+  <w:endnote w:type="separator" w:id="-1">
+    <w:p>
+      <w:pPr>
+        <w:spacing w:after="0" w:line="240" w:lineRule="auto"/>
+      </w:pPr>
+      <w:r>
+        <w:separator/>
+      </w:r>
+    </w:p>
+  </w:endnote>
+  <w:endnote w:type="continuationSeparator" w:id="0">
+    <w:p>
+      <w:pPr>
+        <w:spacing w:after="0" w:line="240" w:lineRule="auto"/>
+      </w:pPr>
+      <w:r>
+        <w:continuationSeparator/>
+      </w:r>
+    </w:p>
+  </w:endnote>
+</w:endnotes>
+</file>
+
+<file path=word/footnotes.xml><?xml version="1.0" encoding="utf-8"?>
+<w:footnotes xmlns:wpc="http://schemas.microsoft.com/office/word/2010/wordprocessingCanvas" xmlns:cx="http://schemas.microsoft.com/office/drawing/2014/chartex" xmlns:cx1="http://schemas.microsoft.com/office/drawing/2015/9/8/chartex" xmlns:cx2="http://schemas.microsoft.com/office/drawing/2015/10/21/chartex" xmlns:cx3="http://schemas.microsoft.com/office/drawing/2016/5/9/chartex" xmlns:cx4="http://schemas.microsoft.com/office/drawing/2016/5/10/chartex" xmlns:cx5="http://schemas.microsoft.com/office/drawing/2016/5/11/chartex" xmlns:cx6="http://schemas.microsoft.com/office/drawing/2016/5/12/chartex" xmlns:cx7="http://schemas.microsoft.com/office/drawing/2016/5/13/chartex" xmlns:cx8="http://schemas.microsoft.com/office/drawing/2016/5/14/chartex" xmlns:mc="http://schemas.openxmlformats.org/markup-compatibility/2006" xmlns:aink="http://schemas.microsoft.com/office/drawing/2016/ink" xmlns:am3d="http://schemas.microsoft.com/office/drawing/2017/model3d" xmlns:o="urn:schemas-microsoft-com:office:office" xmlns:oel="http://schemas.microsoft.com/office/2019/extlst" xmlns:r="http://schemas.openxmlformats.org/officeDocument/2006/relationships" xmlns:m="http://schemas.openxmlformats.org/officeDocument/2006/math" xmlns:v="urn:schemas-microsoft-com:vml" xmlns:wp14="http://schemas.microsoft.com/office/word/2010/wordprocessingDrawing" xmlns:wp="http://schemas.openxmlformats.org/drawingml/2006/wordprocessingDrawing" xmlns:w10="urn:schemas-microsoft-com:office:word" xmlns:w="http://schemas.openxmlformats.org/wordprocessingml/2006/main" xmlns:w14="http://schemas.microsoft.com/office/word/2010/wordml" xmlns:w15="http://schemas.microsoft.com/office/word/2012/wordml" xmlns:w16cex="http://schemas.microsoft.com/office/word/2018/wordml/cex" xmlns:w16cid="http://schemas.microsoft.com/office/word/2016/wordml/cid" xmlns:w16="http://schemas.microsoft.com/office/word/2018/wordml" xmlns:w16du="http://schemas.microsoft.com/office/word/2023/wordml/word16du" xmlns:w16sdtdh="http://schemas.microsoft.com/office/word/2020/wordml/sdtdatahash" xmlns:w16sdtfl="http://schemas.microsoft.com/office/word/2024/wordml/sdtformatlock" xmlns:w16se="http://schemas.microsoft.com/office/word/2015/wordml/symex" xmlns:wpg="http://schemas.microsoft.com/office/word/2010/wordprocessingGroup" xmlns:wpi="http://schemas.microsoft.com/office/word/2010/wordprocessingInk" xmlns:wne="http://schemas.microsoft.com/office/word/2006/wordml" xmlns:wps="http://schemas.microsoft.com/office/word/2010/wordprocessingShape" mc:Ignorable="w14 w15 w16se w16cid w16 w16cex w16sdtdh w16sdtfl w16du wp14">
+  <w:footnote w:type="separator" w:id="-1">
+    <w:p>
+      <w:pPr>
+        <w:spacing w:after="0" w:line="240" w:lineRule="auto"/>
+      </w:pPr>
+      <w:r>
+        <w:separator/>
+      </w:r>
+    </w:p>
+  </w:footnote>
+  <w:footnote w:type="continuationSeparator" w:id="0">
+    <w:p>
+      <w:pPr>
+        <w:spacing w:after="0" w:line="240" w:lineRule="auto"/>
+      </w:pPr>
+      <w:r>
+        <w:continuationSeparator/>
+      </w:r>
+    </w:p>
+  </w:footnote>
+</w:footnotes>
+</file>
+
+<file path=word/header1.xml><?xml version="1.0" encoding="utf-8"?>
+<w:hdr xmlns:wpc="http://schemas.microsoft.com/office/word/2010/wordprocessingCanvas" xmlns:cx="http://schemas.microsoft.com/office/drawing/2014/chartex" xmlns:cx1="http://schemas.microsoft.com/office/drawing/2015/9/8/chartex" xmlns:cx2="http://schemas.microsoft.com/office/drawing/2015/10/21/chartex" xmlns:cx3="http://schemas.microsoft.com/office/drawing/2016/5/9/chartex" xmlns:cx4="http://schemas.microsoft.com/office/drawing/2016/5/10/chartex" xmlns:cx5="http://schemas.microsoft.com/office/drawing/2016/5/11/chartex" xmlns:cx6="http://schemas.microsoft.com/office/drawing/2016/5/12/chartex" xmlns:cx7="http://schemas.microsoft.com/office/drawing/2016/5/13/chartex" xmlns:cx8="http://schemas.microsoft.com/office/drawing/2016/5/14/chartex" xmlns:mc="http://schemas.openxmlformats.org/markup-compatibility/2006" xmlns:aink="http://schemas.microsoft.com/office/drawing/2016/ink" xmlns:am3d="http://schemas.microsoft.com/office/drawing/2017/model3d" xmlns:o="urn:schemas-microsoft-com:office:office" xmlns:oel="http://schemas.microsoft.com/office/2019/extlst" xmlns:r="http://schemas.openxmlformats.org/officeDocument/2006/relationships" xmlns:m="http://schemas.openxmlformats.org/officeDocument/2006/math" xmlns:v="urn:schemas-microsoft-com:vml" xmlns:wp14="http://schemas.microsoft.com/office/word/2010/wordprocessingDrawing" xmlns:wp="http://schemas.openxmlformats.org/drawingml/2006/wordprocessingDrawing" xmlns:w10="urn:schemas-microsoft-com:office:word" xmlns:w="http://schemas.openxmlformats.org/wordprocessingml/2006/main" xmlns:w14="http://schemas.microsoft.com/office/word/2010/wordml" xmlns:w15="http://schemas.microsoft.com/office/word/2012/wordml" xmlns:w16cex="http://schemas.microsoft.com/office/word/2018/wordml/cex" xmlns:w16cid="http://schemas.microsoft.com/office/word/2016/wordml/cid" xmlns:w16="http://schemas.microsoft.com/office/word/2018/wordml" xmlns:w16du="http://schemas.microsoft.com/office/word/2023/wordml/word16du" xmlns:w16sdtdh="http://schemas.microsoft.com/office/word/2020/wordml/sdtdatahash" xmlns:w16sdtfl="http://schemas.microsoft.com/office/word/2024/wordml/sdtformatlock" xmlns:w16se="http://schemas.microsoft.com/office/word/2015/wordml/symex" xmlns:wpg="http://schemas.microsoft.com/office/word/2010/wordprocessingGroup" xmlns:wpi="http://schemas.microsoft.com/office/word/2010/wordprocessingInk" xmlns:wne="http://schemas.microsoft.com/office/word/2006/wordml" xmlns:wps="http://schemas.microsoft.com/office/word/2010/wordprocessingShape" mc:Ignorable="w14 w15 w16se w16cid w16 w16cex w16sdtdh w16sdtfl w16du wp14">
+  <w:sdt>
+    <w:sdtPr>
+      <w:rPr>
+        <w:rFonts w:ascii="Times New Roman" w:hAnsi="Times New Roman" w:cs="Times New Roman"/>
+        <w:sz w:val="18"/>
+        <w:szCs w:val="18"/>
+      </w:rPr>
+      <w:id w:val="-1318336367"/>
+      <w:docPartObj>
+        <w:docPartGallery w:val="Page Numbers (Top of Page)"/>
+        <w:docPartUnique/>
+      </w:docPartObj>
+    </w:sdtPr>
+    <w:sdtContent>
+      <w:p>
+        <w:pPr>
+          <w:pStyle w:val="Header"/>
+          <w:jc w:val="right"/>
+          <w:rPr>
+            <w:rFonts w:ascii="Times New Roman" w:hAnsi="Times New Roman" w:cs="Times New Roman"/>
+            <w:sz w:val="18"/>
+            <w:szCs w:val="18"/>
+          </w:rPr>
+        </w:pPr>
+        <w:r>
+          <w:rPr>
+            <w:rFonts w:ascii="Times New Roman" w:hAnsi="Times New Roman" w:cs="Times New Roman"/>
+            <w:sz w:val="18"/>
+            <w:szCs w:val="18"/>
+          </w:rPr>
+          <w:t xml:space="preserve">Page </w:t>
+        </w:r>
+        <w:r>
+          <w:rPr>
+            <w:rFonts w:ascii="Times New Roman" w:hAnsi="Times New Roman" w:cs="Times New Roman"/>
+            <w:b/>
+            <w:bCs/>
+            <w:sz w:val="18"/>
+            <w:szCs w:val="18"/>
+          </w:rPr>
+          <w:fldChar w:fldCharType="begin"/>
+        </w:r>
+        <w:r>
+          <w:rPr>
+            <w:rFonts w:ascii="Times New Roman" w:hAnsi="Times New Roman" w:cs="Times New Roman"/>
+            <w:b/>
+            <w:bCs/>
+            <w:sz w:val="18"/>
+            <w:szCs w:val="18"/>
+          </w:rPr>
+          <w:instrText xml:space="preserve"> PAGE </w:instrText>
+        </w:r>
+        <w:r>
+          <w:rPr>
+            <w:rFonts w:ascii="Times New Roman" w:hAnsi="Times New Roman" w:cs="Times New Roman"/>
+            <w:b/>
+            <w:bCs/>
+            <w:sz w:val="18"/>
+            <w:szCs w:val="18"/>
+          </w:rPr>
+          <w:fldChar w:fldCharType="separate"/>
+        </w:r>
+        <w:r>
+          <w:rPr>
+            <w:rFonts w:ascii="Times New Roman" w:hAnsi="Times New Roman" w:cs="Times New Roman"/>
+            <w:b/>
+            <w:bCs/>
+            <w:noProof/>
+            <w:sz w:val="18"/>
+            <w:szCs w:val="18"/>
+          </w:rPr>
+          <w:t>2</w:t>
+        </w:r>
+        <w:r>
+          <w:rPr>
+            <w:rFonts w:ascii="Times New Roman" w:hAnsi="Times New Roman" w:cs="Times New Roman"/>
+            <w:b/>
+            <w:bCs/>
+            <w:sz w:val="18"/>
+            <w:szCs w:val="18"/>
+          </w:rPr>
+          <w:fldChar w:fldCharType="end"/>
+        </w:r>
+        <w:r>
+          <w:rPr>
+            <w:rFonts w:ascii="Times New Roman" w:hAnsi="Times New Roman" w:cs="Times New Roman"/>
+            <w:sz w:val="18"/>
+            <w:szCs w:val="18"/>
+          </w:rPr>
+          <w:t xml:space="preserve"> of </w:t>
+        </w:r>
+        <w:r>
+          <w:rPr>
+            <w:rFonts w:ascii="Times New Roman" w:hAnsi="Times New Roman" w:cs="Times New Roman"/>
+            <w:b/>
+            <w:bCs/>
+            <w:sz w:val="18"/>
+            <w:szCs w:val="18"/>
+          </w:rPr>
+          <w:fldChar w:fldCharType="begin"/>
+        </w:r>
+        <w:r>
+          <w:rPr>
+            <w:rFonts w:ascii="Times New Roman" w:hAnsi="Times New Roman" w:cs="Times New Roman"/>
+            <w:b/>
+            <w:bCs/>
+            <w:sz w:val="18"/>
+            <w:szCs w:val="18"/>
+          </w:rPr>
+          <w:instrText xml:space="preserve"> NUMPAGES  </w:instrText>
+        </w:r>
+        <w:r>
+          <w:rPr>
+            <w:rFonts w:ascii="Times New Roman" w:hAnsi="Times New Roman" w:cs="Times New Roman"/>
+            <w:b/>
+            <w:bCs/>
+            <w:sz w:val="18"/>
+            <w:szCs w:val="18"/>
+          </w:rPr>
+          <w:fldChar w:fldCharType="separate"/>
+        </w:r>
+        <w:r>
+          <w:rPr>
+            <w:rFonts w:ascii="Times New Roman" w:hAnsi="Times New Roman" w:cs="Times New Roman"/>
+            <w:b/>
+            <w:bCs/>
+            <w:noProof/>
+            <w:sz w:val="18"/>
+            <w:szCs w:val="18"/>
+          </w:rPr>
+          <w:t>2</w:t>
+        </w:r>
+        <w:r>
+          <w:rPr>
+            <w:rFonts w:ascii="Times New Roman" w:hAnsi="Times New Roman" w:cs="Times New Roman"/>
+            <w:b/>
+            <w:bCs/>
+            <w:sz w:val="18"/>
+            <w:szCs w:val="18"/>
+          </w:rPr>
+          <w:fldChar w:fldCharType="end"/>
+        </w:r>
+      </w:p>
+    </w:sdtContent>
+  </w:sdt>
+  <w:p>
+    <w:pPr>
+      <w:pStyle w:val="Header"/>
+    </w:pPr>
+  </w:p>
+</w:hdr>
+</file>
+
 <file path=word/numbering.xml><?xml version="1.0" encoding="utf-8"?>
 <w:numbering xmlns:wpc="http://schemas.microsoft.com/office/word/2010/wordprocessingCanvas" xmlns:cx="http://schemas.microsoft.com/office/drawing/2014/chartex" xmlns:cx1="http://schemas.microsoft.com/office/drawing/2015/9/8/chartex" xmlns:cx2="http://schemas.microsoft.com/office/drawing/2015/10/21/chartex" xmlns:cx3="http://schemas.microsoft.com/office/drawing/2016/5/9/chartex" xmlns:cx4="http://schemas.microsoft.com/office/drawing/2016/5/10/chartex" xmlns:cx5="http://schemas.microsoft.com/office/drawing/2016/5/11/chartex" xmlns:cx6="http://schemas.microsoft.com/office/drawing/2016/5/12/chartex" xmlns:cx7="http://schemas.microsoft.com/office/drawing/2016/5/13/chartex" xmlns:cx8="http://schemas.microsoft.com/office/drawing/2016/5/14/chartex" xmlns:mc="http://schemas.openxmlformats.org/markup-compatibility/2006" xmlns:aink="http://schemas.microsoft.com/office/drawing/2016/ink" xmlns:am3d="http://schemas.microsoft.com/office/drawing/2017/model3d" xmlns:o="urn:schemas-microsoft-com:office:office" xmlns:oel="http://schemas.microsoft.com/office/2019/extlst" xmlns:r="http://schemas.openxmlformats.org/officeDocument/2006/relationships" xmlns:m="http://schemas.openxmlformats.org/officeDocument/2006/math" xmlns:v="urn:schemas-microsoft-com:vml" xmlns:wp14="http://schemas.microsoft.com/office/word/2010/wordprocessingDrawing" xmlns:wp="http://schemas.openxmlformats.org/drawingml/2006/wordprocessingDrawing" xmlns:w10="urn:schemas-microsoft-com:office:word" xmlns:w="http://schemas.openxmlformats.org/wordprocessingml/2006/main" xmlns:w14="http://schemas.microsoft.com/office/word/2010/wordml" xmlns:w15="http://schemas.microsoft.com/office/word/2012/wordml" xmlns:w16cex="http://schemas.microsoft.com/office/word/2018/wordml/cex" xmlns:w16cid="http://schemas.microsoft.com/office/word/2016/wordml/cid" xmlns:w16="http://schemas.microsoft.com/office/word/2018/wordml" xmlns:w16du="http://schemas.microsoft.com/office/word/2023/wordml/word16du" xmlns:w16sdtdh="http://schemas.microsoft.com/office/word/2020/wordml/sdtdatahash" xmlns:w16sdtfl="http://schemas.microsoft.com/office/word/2024/wordml/sdtformatlock" xmlns:w16se="http://schemas.microsoft.com/office/word/2015/wordml/symex" xmlns:wpg="http://schemas.microsoft.com/office/word/2010/wordprocessingGroup" xmlns:wpi="http://schemas.microsoft.com/office/word/2010/wordprocessingInk" xmlns:wne="http://schemas.microsoft.com/office/word/2006/wordml" xmlns:wps="http://schemas.microsoft.com/office/word/2010/wordprocessingShape" mc:Ignorable="w14 w15 w16se w16cid w16 w16cex w16sdtdh w16sdtfl w16du wp14">
   <w:abstractNum w:abstractNumId="0" w15:restartNumberingAfterBreak="0">
-    <w:nsid w:val="6FA14681"/>
+    <w:nsid w:val="5E6F0D75"/>
     <w:multiLevelType w:val="hybridMultilevel"/>
-    <w:tmpl w:val="0084160C"/>
-    <w:lvl w:ilvl="0" w:tplc="CD5CD946">
+    <w:tmpl w:val="55A8635C"/>
+    <w:lvl w:ilvl="0" w:tplc="9A041210">
       <w:numFmt w:val="bullet"/>
-      <w:lvlText w:val=""/>
+      <w:lvlText w:val="-"/>
       <w:lvlJc w:val="left"/>
       <w:pPr>
-        <w:ind w:left="1800" w:hanging="360"/>
+        <w:ind w:left="2520" w:hanging="360"/>
       </w:pPr>
       <w:rPr>
-        <w:rFonts w:ascii="Symbol" w:eastAsiaTheme="minorHAnsi" w:hAnsi="Symbol" w:cs="Times New Roman" w:hint="default"/>
+        <w:rFonts w:ascii="Times New Roman" w:eastAsiaTheme="minorHAnsi" w:hAnsi="Times New Roman" w:cs="Times New Roman" w:hint="default"/>
       </w:rPr>
     </w:lvl>
-    <w:lvl w:ilvl="1" w:tplc="04090003" w:tentative="1">
+    <w:lvl w:ilvl="1" w:tplc="04090003">
       <w:start w:val="1"/>
       <w:numFmt w:val="bullet"/>
       <w:lvlText w:val="o"/>
       <w:lvlJc w:val="left"/>
       <w:pPr>
-        <w:ind w:left="2520" w:hanging="360"/>
+        <w:ind w:left="3240" w:hanging="360"/>
       </w:pPr>
       <w:rPr>
         <w:rFonts w:ascii="Courier New" w:hAnsi="Courier New" w:cs="Courier New" w:hint="default"/>
@@ -1020,7 +3299,7 @@
       <w:lvlText w:val=""/>
       <w:lvlJc w:val="left"/>
       <w:pPr>
-        <w:ind w:left="3240" w:hanging="360"/>
+        <w:ind w:left="3960" w:hanging="360"/>
       </w:pPr>
       <w:rPr>
         <w:rFonts w:ascii="Wingdings" w:hAnsi="Wingdings" w:hint="default"/>
@@ -1032,7 +3311,7 @@
       <w:lvlText w:val=""/>
       <w:lvlJc w:val="left"/>
       <w:pPr>
-        <w:ind w:left="3960" w:hanging="360"/>
+        <w:ind w:left="4680" w:hanging="360"/>
       </w:pPr>
       <w:rPr>
         <w:rFonts w:ascii="Symbol" w:hAnsi="Symbol" w:hint="default"/>
@@ -1044,7 +3323,7 @@
       <w:lvlText w:val="o"/>
       <w:lvlJc w:val="left"/>
       <w:pPr>
-        <w:ind w:left="4680" w:hanging="360"/>
+        <w:ind w:left="5400" w:hanging="360"/>
       </w:pPr>
       <w:rPr>
         <w:rFonts w:ascii="Courier New" w:hAnsi="Courier New" w:cs="Courier New" w:hint="default"/>
@@ -1056,7 +3335,7 @@
       <w:lvlText w:val=""/>
       <w:lvlJc w:val="left"/>
       <w:pPr>
-        <w:ind w:left="5400" w:hanging="360"/>
+        <w:ind w:left="6120" w:hanging="360"/>
       </w:pPr>
       <w:rPr>
         <w:rFonts w:ascii="Wingdings" w:hAnsi="Wingdings" w:hint="default"/>
@@ -1068,7 +3347,7 @@
       <w:lvlText w:val=""/>
       <w:lvlJc w:val="left"/>
       <w:pPr>
-        <w:ind w:left="6120" w:hanging="360"/>
+        <w:ind w:left="6840" w:hanging="360"/>
       </w:pPr>
       <w:rPr>
         <w:rFonts w:ascii="Symbol" w:hAnsi="Symbol" w:hint="default"/>
@@ -1080,7 +3359,7 @@
       <w:lvlText w:val="o"/>
       <w:lvlJc w:val="left"/>
       <w:pPr>
-        <w:ind w:left="6840" w:hanging="360"/>
+        <w:ind w:left="7560" w:hanging="360"/>
       </w:pPr>
       <w:rPr>
         <w:rFonts w:ascii="Courier New" w:hAnsi="Courier New" w:cs="Courier New" w:hint="default"/>
@@ -1092,6 +3371,118 @@
       <w:lvlText w:val=""/>
       <w:lvlJc w:val="left"/>
       <w:pPr>
+        <w:ind w:left="8280" w:hanging="360"/>
+      </w:pPr>
+      <w:rPr>
+        <w:rFonts w:ascii="Wingdings" w:hAnsi="Wingdings" w:hint="default"/>
+      </w:rPr>
+    </w:lvl>
+  </w:abstractNum>
+  <w:abstractNum w:abstractNumId="1" w15:restartNumberingAfterBreak="0">
+    <w:nsid w:val="6FA14681"/>
+    <w:multiLevelType w:val="hybridMultilevel"/>
+    <w:tmpl w:val="0084160C"/>
+    <w:lvl w:ilvl="0" w:tplc="CD5CD946">
+      <w:numFmt w:val="bullet"/>
+      <w:lvlText w:val=""/>
+      <w:lvlJc w:val="left"/>
+      <w:pPr>
+        <w:ind w:left="1800" w:hanging="360"/>
+      </w:pPr>
+      <w:rPr>
+        <w:rFonts w:ascii="Symbol" w:eastAsiaTheme="minorHAnsi" w:hAnsi="Symbol" w:cs="Times New Roman" w:hint="default"/>
+      </w:rPr>
+    </w:lvl>
+    <w:lvl w:ilvl="1" w:tplc="04090003">
+      <w:start w:val="1"/>
+      <w:numFmt w:val="bullet"/>
+      <w:lvlText w:val="o"/>
+      <w:lvlJc w:val="left"/>
+      <w:pPr>
+        <w:ind w:left="2520" w:hanging="360"/>
+      </w:pPr>
+      <w:rPr>
+        <w:rFonts w:ascii="Courier New" w:hAnsi="Courier New" w:cs="Courier New" w:hint="default"/>
+      </w:rPr>
+    </w:lvl>
+    <w:lvl w:ilvl="2" w:tplc="04090005" w:tentative="1">
+      <w:start w:val="1"/>
+      <w:numFmt w:val="bullet"/>
+      <w:lvlText w:val=""/>
+      <w:lvlJc w:val="left"/>
+      <w:pPr>
+        <w:ind w:left="3240" w:hanging="360"/>
+      </w:pPr>
+      <w:rPr>
+        <w:rFonts w:ascii="Wingdings" w:hAnsi="Wingdings" w:hint="default"/>
+      </w:rPr>
+    </w:lvl>
+    <w:lvl w:ilvl="3" w:tplc="04090001" w:tentative="1">
+      <w:start w:val="1"/>
+      <w:numFmt w:val="bullet"/>
+      <w:lvlText w:val=""/>
+      <w:lvlJc w:val="left"/>
+      <w:pPr>
+        <w:ind w:left="3960" w:hanging="360"/>
+      </w:pPr>
+      <w:rPr>
+        <w:rFonts w:ascii="Symbol" w:hAnsi="Symbol" w:hint="default"/>
+      </w:rPr>
+    </w:lvl>
+    <w:lvl w:ilvl="4" w:tplc="04090003" w:tentative="1">
+      <w:start w:val="1"/>
+      <w:numFmt w:val="bullet"/>
+      <w:lvlText w:val="o"/>
+      <w:lvlJc w:val="left"/>
+      <w:pPr>
+        <w:ind w:left="4680" w:hanging="360"/>
+      </w:pPr>
+      <w:rPr>
+        <w:rFonts w:ascii="Courier New" w:hAnsi="Courier New" w:cs="Courier New" w:hint="default"/>
+      </w:rPr>
+    </w:lvl>
+    <w:lvl w:ilvl="5" w:tplc="04090005" w:tentative="1">
+      <w:start w:val="1"/>
+      <w:numFmt w:val="bullet"/>
+      <w:lvlText w:val=""/>
+      <w:lvlJc w:val="left"/>
+      <w:pPr>
+        <w:ind w:left="5400" w:hanging="360"/>
+      </w:pPr>
+      <w:rPr>
+        <w:rFonts w:ascii="Wingdings" w:hAnsi="Wingdings" w:hint="default"/>
+      </w:rPr>
+    </w:lvl>
+    <w:lvl w:ilvl="6" w:tplc="04090001" w:tentative="1">
+      <w:start w:val="1"/>
+      <w:numFmt w:val="bullet"/>
+      <w:lvlText w:val=""/>
+      <w:lvlJc w:val="left"/>
+      <w:pPr>
+        <w:ind w:left="6120" w:hanging="360"/>
+      </w:pPr>
+      <w:rPr>
+        <w:rFonts w:ascii="Symbol" w:hAnsi="Symbol" w:hint="default"/>
+      </w:rPr>
+    </w:lvl>
+    <w:lvl w:ilvl="7" w:tplc="04090003" w:tentative="1">
+      <w:start w:val="1"/>
+      <w:numFmt w:val="bullet"/>
+      <w:lvlText w:val="o"/>
+      <w:lvlJc w:val="left"/>
+      <w:pPr>
+        <w:ind w:left="6840" w:hanging="360"/>
+      </w:pPr>
+      <w:rPr>
+        <w:rFonts w:ascii="Courier New" w:hAnsi="Courier New" w:cs="Courier New" w:hint="default"/>
+      </w:rPr>
+    </w:lvl>
+    <w:lvl w:ilvl="8" w:tplc="04090005" w:tentative="1">
+      <w:start w:val="1"/>
+      <w:numFmt w:val="bullet"/>
+      <w:lvlText w:val=""/>
+      <w:lvlJc w:val="left"/>
+      <w:pPr>
         <w:ind w:left="7560" w:hanging="360"/>
       </w:pPr>
       <w:rPr>
@@ -1100,6 +3491,9 @@
     </w:lvl>
   </w:abstractNum>
   <w:num w:numId="1" w16cid:durableId="782307180">
+    <w:abstractNumId w:val="1"/>
+  </w:num>
+  <w:num w:numId="2" w16cid:durableId="50467619">
     <w:abstractNumId w:val="0"/>
   </w:num>
 </w:numbering>
@@ -1708,7 +4102,6 @@
   <w:style w:type="character" w:default="1" w:styleId="DefaultParagraphFont">
     <w:name w:val="Default Paragraph Font"/>
     <w:uiPriority w:val="1"/>
-    <w:semiHidden/>
     <w:unhideWhenUsed/>
   </w:style>
   <w:style w:type="table" w:default="1" w:styleId="TableNormal">
@@ -2057,6 +4450,50 @@
       <w:u w:val="single"/>
     </w:rPr>
   </w:style>
+  <w:style w:type="paragraph" w:styleId="Header">
+    <w:name w:val="header"/>
+    <w:basedOn w:val="Normal"/>
+    <w:link w:val="HeaderChar"/>
+    <w:uiPriority w:val="99"/>
+    <w:unhideWhenUsed/>
+    <w:rsid w:val="00F93E8C"/>
+    <w:pPr>
+      <w:tabs>
+        <w:tab w:val="center" w:pos="4680"/>
+        <w:tab w:val="right" w:pos="9360"/>
+      </w:tabs>
+      <w:spacing w:after="0" w:line="240" w:lineRule="auto"/>
+    </w:pPr>
+  </w:style>
+  <w:style w:type="character" w:customStyle="1" w:styleId="HeaderChar">
+    <w:name w:val="Header Char"/>
+    <w:basedOn w:val="DefaultParagraphFont"/>
+    <w:link w:val="Header"/>
+    <w:uiPriority w:val="99"/>
+    <w:rsid w:val="00F93E8C"/>
+  </w:style>
+  <w:style w:type="paragraph" w:styleId="Footer">
+    <w:name w:val="footer"/>
+    <w:basedOn w:val="Normal"/>
+    <w:link w:val="FooterChar"/>
+    <w:uiPriority w:val="99"/>
+    <w:unhideWhenUsed/>
+    <w:rsid w:val="00F93E8C"/>
+    <w:pPr>
+      <w:tabs>
+        <w:tab w:val="center" w:pos="4680"/>
+        <w:tab w:val="right" w:pos="9360"/>
+      </w:tabs>
+      <w:spacing w:after="0" w:line="240" w:lineRule="auto"/>
+    </w:pPr>
+  </w:style>
+  <w:style w:type="character" w:customStyle="1" w:styleId="FooterChar">
+    <w:name w:val="Footer Char"/>
+    <w:basedOn w:val="DefaultParagraphFont"/>
+    <w:link w:val="Footer"/>
+    <w:uiPriority w:val="99"/>
+    <w:rsid w:val="00F93E8C"/>
+  </w:style>
 </w:styles>
 </file>
 

</xml_diff>